<commit_message>
Update Lab 04 report
</commit_message>
<xml_diff>
--- a/LAB 04/Data Types and OS Memory Management.docx
+++ b/LAB 04/Data Types and OS Memory Management.docx
@@ -418,14 +418,2694 @@
         </w:rPr>
       </w:pPr>
     </w:p>
+    <w:sdt>
+      <w:sdtPr>
+        <w:id w:val="-420259059"/>
+        <w:docPartObj>
+          <w:docPartGallery w:val="Table of Contents"/>
+          <w:docPartUnique/>
+        </w:docPartObj>
+      </w:sdtPr>
+      <w:sdtEndPr>
+        <w:rPr>
+          <w:rFonts w:asciiTheme="minorHAnsi" w:eastAsiaTheme="minorHAnsi" w:hAnsiTheme="minorHAnsi" w:cstheme="minorBidi"/>
+          <w:b/>
+          <w:bCs/>
+          <w:noProof/>
+          <w:color w:val="auto"/>
+          <w:kern w:val="2"/>
+          <w:sz w:val="24"/>
+          <w:szCs w:val="24"/>
+          <w14:ligatures w14:val="standardContextual"/>
+        </w:rPr>
+      </w:sdtEndPr>
+      <w:sdtContent>
+        <w:p>
+          <w:pPr>
+            <w:pStyle w:val="TOCHeading"/>
+            <w:rPr>
+              <w:sz w:val="40"/>
+              <w:szCs w:val="40"/>
+            </w:rPr>
+          </w:pPr>
+          <w:r>
+            <w:rPr>
+              <w:sz w:val="40"/>
+              <w:szCs w:val="40"/>
+            </w:rPr>
+            <w:t>Table Of Contents</w:t>
+          </w:r>
+        </w:p>
+        <w:p>
+          <w:pPr>
+            <w:pStyle w:val="TOC1"/>
+            <w:tabs>
+              <w:tab w:val="right" w:leader="dot" w:pos="9350"/>
+            </w:tabs>
+            <w:rPr>
+              <w:noProof/>
+            </w:rPr>
+          </w:pPr>
+          <w:r>
+            <w:fldChar w:fldCharType="begin"/>
+          </w:r>
+          <w:r>
+            <w:instrText xml:space="preserve"> TOC \o "1-3" \h \z \u </w:instrText>
+          </w:r>
+          <w:r>
+            <w:fldChar w:fldCharType="separate"/>
+          </w:r>
+          <w:hyperlink w:anchor="_Toc241675052" w:history="1">
+            <w:r>
+              <w:rPr>
+                <w:rStyle w:val="Hyperlink"/>
+                <w:noProof/>
+              </w:rPr>
+              <w:t>1. Introduction</w:t>
+            </w:r>
+            <w:r>
+              <w:rPr>
+                <w:noProof/>
+                <w:webHidden/>
+              </w:rPr>
+              <w:tab/>
+            </w:r>
+            <w:r>
+              <w:rPr>
+                <w:noProof/>
+                <w:webHidden/>
+              </w:rPr>
+              <w:fldChar w:fldCharType="begin"/>
+            </w:r>
+            <w:r>
+              <w:rPr>
+                <w:noProof/>
+                <w:webHidden/>
+              </w:rPr>
+              <w:instrText xml:space="preserve"> PAGEREF _Toc241675052 \h </w:instrText>
+            </w:r>
+            <w:r>
+              <w:rPr>
+                <w:noProof/>
+                <w:webHidden/>
+              </w:rPr>
+            </w:r>
+            <w:r>
+              <w:rPr>
+                <w:noProof/>
+                <w:webHidden/>
+              </w:rPr>
+              <w:fldChar w:fldCharType="separate"/>
+            </w:r>
+            <w:r>
+              <w:rPr>
+                <w:noProof/>
+                <w:webHidden/>
+              </w:rPr>
+              <w:t>2</w:t>
+            </w:r>
+            <w:r>
+              <w:rPr>
+                <w:noProof/>
+                <w:webHidden/>
+              </w:rPr>
+              <w:fldChar w:fldCharType="end"/>
+            </w:r>
+          </w:hyperlink>
+        </w:p>
+        <w:p>
+          <w:pPr>
+            <w:pStyle w:val="TOC1"/>
+            <w:tabs>
+              <w:tab w:val="right" w:leader="dot" w:pos="9350"/>
+            </w:tabs>
+            <w:rPr>
+              <w:noProof/>
+            </w:rPr>
+          </w:pPr>
+          <w:hyperlink w:anchor="_Toc241675053" w:history="1">
+            <w:r>
+              <w:rPr>
+                <w:rStyle w:val="Hyperlink"/>
+                <w:noProof/>
+              </w:rPr>
+              <w:t>2. Objectives</w:t>
+            </w:r>
+            <w:r>
+              <w:rPr>
+                <w:noProof/>
+                <w:webHidden/>
+              </w:rPr>
+              <w:tab/>
+            </w:r>
+            <w:r>
+              <w:rPr>
+                <w:noProof/>
+                <w:webHidden/>
+              </w:rPr>
+              <w:fldChar w:fldCharType="begin"/>
+            </w:r>
+            <w:r>
+              <w:rPr>
+                <w:noProof/>
+                <w:webHidden/>
+              </w:rPr>
+              <w:instrText xml:space="preserve"> PAGEREF _Toc241675053 \h </w:instrText>
+            </w:r>
+            <w:r>
+              <w:rPr>
+                <w:noProof/>
+                <w:webHidden/>
+              </w:rPr>
+            </w:r>
+            <w:r>
+              <w:rPr>
+                <w:noProof/>
+                <w:webHidden/>
+              </w:rPr>
+              <w:fldChar w:fldCharType="separate"/>
+            </w:r>
+            <w:r>
+              <w:rPr>
+                <w:noProof/>
+                <w:webHidden/>
+              </w:rPr>
+              <w:t>2</w:t>
+            </w:r>
+            <w:r>
+              <w:rPr>
+                <w:noProof/>
+                <w:webHidden/>
+              </w:rPr>
+              <w:fldChar w:fldCharType="end"/>
+            </w:r>
+          </w:hyperlink>
+        </w:p>
+        <w:p>
+          <w:pPr>
+            <w:pStyle w:val="TOC1"/>
+            <w:tabs>
+              <w:tab w:val="right" w:leader="dot" w:pos="9350"/>
+            </w:tabs>
+            <w:rPr>
+              <w:noProof/>
+            </w:rPr>
+          </w:pPr>
+          <w:hyperlink w:anchor="_Toc241675054" w:history="1">
+            <w:r>
+              <w:rPr>
+                <w:rStyle w:val="Hyperlink"/>
+                <w:noProof/>
+              </w:rPr>
+              <w:t>3. Tools and Environment</w:t>
+            </w:r>
+            <w:r>
+              <w:rPr>
+                <w:noProof/>
+                <w:webHidden/>
+              </w:rPr>
+              <w:tab/>
+            </w:r>
+            <w:r>
+              <w:rPr>
+                <w:noProof/>
+                <w:webHidden/>
+              </w:rPr>
+              <w:fldChar w:fldCharType="begin"/>
+            </w:r>
+            <w:r>
+              <w:rPr>
+                <w:noProof/>
+                <w:webHidden/>
+              </w:rPr>
+              <w:instrText xml:space="preserve"> PAGEREF _Toc241675054 \h </w:instrText>
+            </w:r>
+            <w:r>
+              <w:rPr>
+                <w:noProof/>
+                <w:webHidden/>
+              </w:rPr>
+            </w:r>
+            <w:r>
+              <w:rPr>
+                <w:noProof/>
+                <w:webHidden/>
+              </w:rPr>
+              <w:fldChar w:fldCharType="separate"/>
+            </w:r>
+            <w:r>
+              <w:rPr>
+                <w:noProof/>
+                <w:webHidden/>
+              </w:rPr>
+              <w:t>2</w:t>
+            </w:r>
+            <w:r>
+              <w:rPr>
+                <w:noProof/>
+                <w:webHidden/>
+              </w:rPr>
+              <w:fldChar w:fldCharType="end"/>
+            </w:r>
+          </w:hyperlink>
+        </w:p>
+        <w:p>
+          <w:pPr>
+            <w:pStyle w:val="TOC1"/>
+            <w:tabs>
+              <w:tab w:val="right" w:leader="dot" w:pos="9350"/>
+            </w:tabs>
+            <w:rPr>
+              <w:noProof/>
+            </w:rPr>
+          </w:pPr>
+          <w:hyperlink w:anchor="_Toc241675055" w:history="1">
+            <w:r>
+              <w:rPr>
+                <w:rStyle w:val="Hyperlink"/>
+                <w:noProof/>
+              </w:rPr>
+              <w:t>4. Experiment 1: Data Type Size</w:t>
+            </w:r>
+            <w:r>
+              <w:rPr>
+                <w:noProof/>
+                <w:webHidden/>
+              </w:rPr>
+              <w:tab/>
+            </w:r>
+            <w:r>
+              <w:rPr>
+                <w:noProof/>
+                <w:webHidden/>
+              </w:rPr>
+              <w:fldChar w:fldCharType="begin"/>
+            </w:r>
+            <w:r>
+              <w:rPr>
+                <w:noProof/>
+                <w:webHidden/>
+              </w:rPr>
+              <w:instrText xml:space="preserve"> PAGEREF _Toc241675055 \h </w:instrText>
+            </w:r>
+            <w:r>
+              <w:rPr>
+                <w:noProof/>
+                <w:webHidden/>
+              </w:rPr>
+            </w:r>
+            <w:r>
+              <w:rPr>
+                <w:noProof/>
+                <w:webHidden/>
+              </w:rPr>
+              <w:fldChar w:fldCharType="separate"/>
+            </w:r>
+            <w:r>
+              <w:rPr>
+                <w:noProof/>
+                <w:webHidden/>
+              </w:rPr>
+              <w:t>2</w:t>
+            </w:r>
+            <w:r>
+              <w:rPr>
+                <w:noProof/>
+                <w:webHidden/>
+              </w:rPr>
+              <w:fldChar w:fldCharType="end"/>
+            </w:r>
+          </w:hyperlink>
+        </w:p>
+        <w:p>
+          <w:pPr>
+            <w:pStyle w:val="TOC2"/>
+            <w:tabs>
+              <w:tab w:val="right" w:leader="dot" w:pos="9350"/>
+            </w:tabs>
+            <w:rPr>
+              <w:noProof/>
+            </w:rPr>
+          </w:pPr>
+          <w:hyperlink w:anchor="_Toc241675056" w:history="1">
+            <w:r>
+              <w:rPr>
+                <w:rStyle w:val="Hyperlink"/>
+                <w:noProof/>
+              </w:rPr>
+              <w:t>4.1 Create the C Source File</w:t>
+            </w:r>
+            <w:r>
+              <w:rPr>
+                <w:noProof/>
+                <w:webHidden/>
+              </w:rPr>
+              <w:tab/>
+            </w:r>
+            <w:r>
+              <w:rPr>
+                <w:noProof/>
+                <w:webHidden/>
+              </w:rPr>
+              <w:fldChar w:fldCharType="begin"/>
+            </w:r>
+            <w:r>
+              <w:rPr>
+                <w:noProof/>
+                <w:webHidden/>
+              </w:rPr>
+              <w:instrText xml:space="preserve"> PAGEREF _Toc241675056 \h </w:instrText>
+            </w:r>
+            <w:r>
+              <w:rPr>
+                <w:noProof/>
+                <w:webHidden/>
+              </w:rPr>
+            </w:r>
+            <w:r>
+              <w:rPr>
+                <w:noProof/>
+                <w:webHidden/>
+              </w:rPr>
+              <w:fldChar w:fldCharType="separate"/>
+            </w:r>
+            <w:r>
+              <w:rPr>
+                <w:noProof/>
+                <w:webHidden/>
+              </w:rPr>
+              <w:t>2</w:t>
+            </w:r>
+            <w:r>
+              <w:rPr>
+                <w:noProof/>
+                <w:webHidden/>
+              </w:rPr>
+              <w:fldChar w:fldCharType="end"/>
+            </w:r>
+          </w:hyperlink>
+        </w:p>
+        <w:p>
+          <w:pPr>
+            <w:pStyle w:val="TOC2"/>
+            <w:tabs>
+              <w:tab w:val="right" w:leader="dot" w:pos="9350"/>
+            </w:tabs>
+            <w:rPr>
+              <w:noProof/>
+            </w:rPr>
+          </w:pPr>
+          <w:hyperlink w:anchor="_Toc241675057" w:history="1">
+            <w:r>
+              <w:rPr>
+                <w:rStyle w:val="Hyperlink"/>
+                <w:noProof/>
+              </w:rPr>
+              <w:t>4.2 Verify the C Source Code</w:t>
+            </w:r>
+            <w:r>
+              <w:rPr>
+                <w:noProof/>
+                <w:webHidden/>
+              </w:rPr>
+              <w:tab/>
+            </w:r>
+            <w:r>
+              <w:rPr>
+                <w:noProof/>
+                <w:webHidden/>
+              </w:rPr>
+              <w:fldChar w:fldCharType="begin"/>
+            </w:r>
+            <w:r>
+              <w:rPr>
+                <w:noProof/>
+                <w:webHidden/>
+              </w:rPr>
+              <w:instrText xml:space="preserve"> PAGEREF _Toc241675057 \h </w:instrText>
+            </w:r>
+            <w:r>
+              <w:rPr>
+                <w:noProof/>
+                <w:webHidden/>
+              </w:rPr>
+            </w:r>
+            <w:r>
+              <w:rPr>
+                <w:noProof/>
+                <w:webHidden/>
+              </w:rPr>
+              <w:fldChar w:fldCharType="separate"/>
+            </w:r>
+            <w:r>
+              <w:rPr>
+                <w:noProof/>
+                <w:webHidden/>
+              </w:rPr>
+              <w:t>3</w:t>
+            </w:r>
+            <w:r>
+              <w:rPr>
+                <w:noProof/>
+                <w:webHidden/>
+              </w:rPr>
+              <w:fldChar w:fldCharType="end"/>
+            </w:r>
+          </w:hyperlink>
+        </w:p>
+        <w:p>
+          <w:pPr>
+            <w:pStyle w:val="TOC2"/>
+            <w:tabs>
+              <w:tab w:val="right" w:leader="dot" w:pos="9350"/>
+            </w:tabs>
+            <w:rPr>
+              <w:noProof/>
+            </w:rPr>
+          </w:pPr>
+          <w:hyperlink w:anchor="_Toc241675058" w:history="1">
+            <w:r>
+              <w:rPr>
+                <w:rStyle w:val="Hyperlink"/>
+                <w:noProof/>
+              </w:rPr>
+              <w:t>4.3 Compile the Program</w:t>
+            </w:r>
+            <w:r>
+              <w:rPr>
+                <w:noProof/>
+                <w:webHidden/>
+              </w:rPr>
+              <w:tab/>
+            </w:r>
+            <w:r>
+              <w:rPr>
+                <w:noProof/>
+                <w:webHidden/>
+              </w:rPr>
+              <w:fldChar w:fldCharType="begin"/>
+            </w:r>
+            <w:r>
+              <w:rPr>
+                <w:noProof/>
+                <w:webHidden/>
+              </w:rPr>
+              <w:instrText xml:space="preserve"> PAGEREF _Toc241675058 \h </w:instrText>
+            </w:r>
+            <w:r>
+              <w:rPr>
+                <w:noProof/>
+                <w:webHidden/>
+              </w:rPr>
+            </w:r>
+            <w:r>
+              <w:rPr>
+                <w:noProof/>
+                <w:webHidden/>
+              </w:rPr>
+              <w:fldChar w:fldCharType="separate"/>
+            </w:r>
+            <w:r>
+              <w:rPr>
+                <w:noProof/>
+                <w:webHidden/>
+              </w:rPr>
+              <w:t>3</w:t>
+            </w:r>
+            <w:r>
+              <w:rPr>
+                <w:noProof/>
+                <w:webHidden/>
+              </w:rPr>
+              <w:fldChar w:fldCharType="end"/>
+            </w:r>
+          </w:hyperlink>
+        </w:p>
+        <w:p>
+          <w:pPr>
+            <w:pStyle w:val="TOC2"/>
+            <w:tabs>
+              <w:tab w:val="right" w:leader="dot" w:pos="9350"/>
+            </w:tabs>
+            <w:rPr>
+              <w:noProof/>
+            </w:rPr>
+          </w:pPr>
+          <w:hyperlink w:anchor="_Toc241675059" w:history="1">
+            <w:r>
+              <w:rPr>
+                <w:rStyle w:val="Hyperlink"/>
+                <w:noProof/>
+              </w:rPr>
+              <w:t>4.4 Run the Program</w:t>
+            </w:r>
+            <w:r>
+              <w:rPr>
+                <w:noProof/>
+                <w:webHidden/>
+              </w:rPr>
+              <w:tab/>
+            </w:r>
+            <w:r>
+              <w:rPr>
+                <w:noProof/>
+                <w:webHidden/>
+              </w:rPr>
+              <w:fldChar w:fldCharType="begin"/>
+            </w:r>
+            <w:r>
+              <w:rPr>
+                <w:noProof/>
+                <w:webHidden/>
+              </w:rPr>
+              <w:instrText xml:space="preserve"> PAGEREF _Toc241675059 \h </w:instrText>
+            </w:r>
+            <w:r>
+              <w:rPr>
+                <w:noProof/>
+                <w:webHidden/>
+              </w:rPr>
+            </w:r>
+            <w:r>
+              <w:rPr>
+                <w:noProof/>
+                <w:webHidden/>
+              </w:rPr>
+              <w:fldChar w:fldCharType="separate"/>
+            </w:r>
+            <w:r>
+              <w:rPr>
+                <w:noProof/>
+                <w:webHidden/>
+              </w:rPr>
+              <w:t>4</w:t>
+            </w:r>
+            <w:r>
+              <w:rPr>
+                <w:noProof/>
+                <w:webHidden/>
+              </w:rPr>
+              <w:fldChar w:fldCharType="end"/>
+            </w:r>
+          </w:hyperlink>
+        </w:p>
+        <w:p>
+          <w:pPr>
+            <w:pStyle w:val="TOC2"/>
+            <w:tabs>
+              <w:tab w:val="right" w:leader="dot" w:pos="9350"/>
+            </w:tabs>
+            <w:rPr>
+              <w:noProof/>
+            </w:rPr>
+          </w:pPr>
+          <w:hyperlink w:anchor="_Toc241675060" w:history="1">
+            <w:r>
+              <w:rPr>
+                <w:rStyle w:val="Hyperlink"/>
+                <w:noProof/>
+              </w:rPr>
+              <w:t>4.5 View the Generated Files</w:t>
+            </w:r>
+            <w:r>
+              <w:rPr>
+                <w:noProof/>
+                <w:webHidden/>
+              </w:rPr>
+              <w:tab/>
+            </w:r>
+            <w:r>
+              <w:rPr>
+                <w:noProof/>
+                <w:webHidden/>
+              </w:rPr>
+              <w:fldChar w:fldCharType="begin"/>
+            </w:r>
+            <w:r>
+              <w:rPr>
+                <w:noProof/>
+                <w:webHidden/>
+              </w:rPr>
+              <w:instrText xml:space="preserve"> PAGEREF _Toc241675060 \h </w:instrText>
+            </w:r>
+            <w:r>
+              <w:rPr>
+                <w:noProof/>
+                <w:webHidden/>
+              </w:rPr>
+            </w:r>
+            <w:r>
+              <w:rPr>
+                <w:noProof/>
+                <w:webHidden/>
+              </w:rPr>
+              <w:fldChar w:fldCharType="separate"/>
+            </w:r>
+            <w:r>
+              <w:rPr>
+                <w:noProof/>
+                <w:webHidden/>
+              </w:rPr>
+              <w:t>4</w:t>
+            </w:r>
+            <w:r>
+              <w:rPr>
+                <w:noProof/>
+                <w:webHidden/>
+              </w:rPr>
+              <w:fldChar w:fldCharType="end"/>
+            </w:r>
+          </w:hyperlink>
+        </w:p>
+        <w:p>
+          <w:pPr>
+            <w:pStyle w:val="TOC1"/>
+            <w:tabs>
+              <w:tab w:val="right" w:leader="dot" w:pos="9350"/>
+            </w:tabs>
+            <w:rPr>
+              <w:noProof/>
+            </w:rPr>
+          </w:pPr>
+          <w:hyperlink w:anchor="_Toc241675061" w:history="1">
+            <w:r>
+              <w:rPr>
+                <w:rStyle w:val="Hyperlink"/>
+                <w:noProof/>
+              </w:rPr>
+              <w:t>5. Experiment 2: Pointer and Dynamic Memory</w:t>
+            </w:r>
+            <w:r>
+              <w:rPr>
+                <w:noProof/>
+                <w:webHidden/>
+              </w:rPr>
+              <w:tab/>
+            </w:r>
+            <w:r>
+              <w:rPr>
+                <w:noProof/>
+                <w:webHidden/>
+              </w:rPr>
+              <w:fldChar w:fldCharType="begin"/>
+            </w:r>
+            <w:r>
+              <w:rPr>
+                <w:noProof/>
+                <w:webHidden/>
+              </w:rPr>
+              <w:instrText xml:space="preserve"> PAGEREF _Toc241675061 \h </w:instrText>
+            </w:r>
+            <w:r>
+              <w:rPr>
+                <w:noProof/>
+                <w:webHidden/>
+              </w:rPr>
+            </w:r>
+            <w:r>
+              <w:rPr>
+                <w:noProof/>
+                <w:webHidden/>
+              </w:rPr>
+              <w:fldChar w:fldCharType="separate"/>
+            </w:r>
+            <w:r>
+              <w:rPr>
+                <w:noProof/>
+                <w:webHidden/>
+              </w:rPr>
+              <w:t>5</w:t>
+            </w:r>
+            <w:r>
+              <w:rPr>
+                <w:noProof/>
+                <w:webHidden/>
+              </w:rPr>
+              <w:fldChar w:fldCharType="end"/>
+            </w:r>
+          </w:hyperlink>
+        </w:p>
+        <w:p>
+          <w:pPr>
+            <w:pStyle w:val="TOC2"/>
+            <w:tabs>
+              <w:tab w:val="right" w:leader="dot" w:pos="9350"/>
+            </w:tabs>
+            <w:rPr>
+              <w:noProof/>
+            </w:rPr>
+          </w:pPr>
+          <w:hyperlink w:anchor="_Toc241675062" w:history="1">
+            <w:r>
+              <w:rPr>
+                <w:rStyle w:val="Hyperlink"/>
+                <w:noProof/>
+              </w:rPr>
+              <w:t>5.1 Create the Pointer Program</w:t>
+            </w:r>
+            <w:r>
+              <w:rPr>
+                <w:noProof/>
+                <w:webHidden/>
+              </w:rPr>
+              <w:tab/>
+            </w:r>
+            <w:r>
+              <w:rPr>
+                <w:noProof/>
+                <w:webHidden/>
+              </w:rPr>
+              <w:fldChar w:fldCharType="begin"/>
+            </w:r>
+            <w:r>
+              <w:rPr>
+                <w:noProof/>
+                <w:webHidden/>
+              </w:rPr>
+              <w:instrText xml:space="preserve"> PAGEREF _Toc241675062 \h </w:instrText>
+            </w:r>
+            <w:r>
+              <w:rPr>
+                <w:noProof/>
+                <w:webHidden/>
+              </w:rPr>
+            </w:r>
+            <w:r>
+              <w:rPr>
+                <w:noProof/>
+                <w:webHidden/>
+              </w:rPr>
+              <w:fldChar w:fldCharType="separate"/>
+            </w:r>
+            <w:r>
+              <w:rPr>
+                <w:noProof/>
+                <w:webHidden/>
+              </w:rPr>
+              <w:t>5</w:t>
+            </w:r>
+            <w:r>
+              <w:rPr>
+                <w:noProof/>
+                <w:webHidden/>
+              </w:rPr>
+              <w:fldChar w:fldCharType="end"/>
+            </w:r>
+          </w:hyperlink>
+        </w:p>
+        <w:p>
+          <w:pPr>
+            <w:pStyle w:val="TOC2"/>
+            <w:tabs>
+              <w:tab w:val="right" w:leader="dot" w:pos="9350"/>
+            </w:tabs>
+            <w:rPr>
+              <w:noProof/>
+            </w:rPr>
+          </w:pPr>
+          <w:hyperlink w:anchor="_Toc241675063" w:history="1">
+            <w:r>
+              <w:rPr>
+                <w:rStyle w:val="Hyperlink"/>
+                <w:noProof/>
+              </w:rPr>
+              <w:t>5.2 Verify the Pointer Program</w:t>
+            </w:r>
+            <w:r>
+              <w:rPr>
+                <w:noProof/>
+                <w:webHidden/>
+              </w:rPr>
+              <w:tab/>
+            </w:r>
+            <w:r>
+              <w:rPr>
+                <w:noProof/>
+                <w:webHidden/>
+              </w:rPr>
+              <w:fldChar w:fldCharType="begin"/>
+            </w:r>
+            <w:r>
+              <w:rPr>
+                <w:noProof/>
+                <w:webHidden/>
+              </w:rPr>
+              <w:instrText xml:space="preserve"> PAGEREF _Toc241675063 \h </w:instrText>
+            </w:r>
+            <w:r>
+              <w:rPr>
+                <w:noProof/>
+                <w:webHidden/>
+              </w:rPr>
+            </w:r>
+            <w:r>
+              <w:rPr>
+                <w:noProof/>
+                <w:webHidden/>
+              </w:rPr>
+              <w:fldChar w:fldCharType="separate"/>
+            </w:r>
+            <w:r>
+              <w:rPr>
+                <w:noProof/>
+                <w:webHidden/>
+              </w:rPr>
+              <w:t>5</w:t>
+            </w:r>
+            <w:r>
+              <w:rPr>
+                <w:noProof/>
+                <w:webHidden/>
+              </w:rPr>
+              <w:fldChar w:fldCharType="end"/>
+            </w:r>
+          </w:hyperlink>
+        </w:p>
+        <w:p>
+          <w:pPr>
+            <w:pStyle w:val="TOC2"/>
+            <w:tabs>
+              <w:tab w:val="right" w:leader="dot" w:pos="9350"/>
+            </w:tabs>
+            <w:rPr>
+              <w:noProof/>
+            </w:rPr>
+          </w:pPr>
+          <w:hyperlink w:anchor="_Toc241675064" w:history="1">
+            <w:r>
+              <w:rPr>
+                <w:rStyle w:val="Hyperlink"/>
+                <w:noProof/>
+              </w:rPr>
+              <w:t>5.3 View the Source Code</w:t>
+            </w:r>
+            <w:r>
+              <w:rPr>
+                <w:noProof/>
+                <w:webHidden/>
+              </w:rPr>
+              <w:tab/>
+            </w:r>
+            <w:r>
+              <w:rPr>
+                <w:noProof/>
+                <w:webHidden/>
+              </w:rPr>
+              <w:fldChar w:fldCharType="begin"/>
+            </w:r>
+            <w:r>
+              <w:rPr>
+                <w:noProof/>
+                <w:webHidden/>
+              </w:rPr>
+              <w:instrText xml:space="preserve"> PAGEREF _Toc241675064 \h </w:instrText>
+            </w:r>
+            <w:r>
+              <w:rPr>
+                <w:noProof/>
+                <w:webHidden/>
+              </w:rPr>
+            </w:r>
+            <w:r>
+              <w:rPr>
+                <w:noProof/>
+                <w:webHidden/>
+              </w:rPr>
+              <w:fldChar w:fldCharType="separate"/>
+            </w:r>
+            <w:r>
+              <w:rPr>
+                <w:noProof/>
+                <w:webHidden/>
+              </w:rPr>
+              <w:t>5</w:t>
+            </w:r>
+            <w:r>
+              <w:rPr>
+                <w:noProof/>
+                <w:webHidden/>
+              </w:rPr>
+              <w:fldChar w:fldCharType="end"/>
+            </w:r>
+          </w:hyperlink>
+        </w:p>
+        <w:p>
+          <w:pPr>
+            <w:pStyle w:val="TOC2"/>
+            <w:tabs>
+              <w:tab w:val="right" w:leader="dot" w:pos="9350"/>
+            </w:tabs>
+            <w:rPr>
+              <w:noProof/>
+            </w:rPr>
+          </w:pPr>
+          <w:hyperlink w:anchor="_Toc241675065" w:history="1">
+            <w:r>
+              <w:rPr>
+                <w:rStyle w:val="Hyperlink"/>
+                <w:noProof/>
+              </w:rPr>
+              <w:t>5.4 Compile the Pointer Program</w:t>
+            </w:r>
+            <w:r>
+              <w:rPr>
+                <w:noProof/>
+                <w:webHidden/>
+              </w:rPr>
+              <w:tab/>
+            </w:r>
+            <w:r>
+              <w:rPr>
+                <w:noProof/>
+                <w:webHidden/>
+              </w:rPr>
+              <w:fldChar w:fldCharType="begin"/>
+            </w:r>
+            <w:r>
+              <w:rPr>
+                <w:noProof/>
+                <w:webHidden/>
+              </w:rPr>
+              <w:instrText xml:space="preserve"> PAGEREF _Toc241675065 \h </w:instrText>
+            </w:r>
+            <w:r>
+              <w:rPr>
+                <w:noProof/>
+                <w:webHidden/>
+              </w:rPr>
+            </w:r>
+            <w:r>
+              <w:rPr>
+                <w:noProof/>
+                <w:webHidden/>
+              </w:rPr>
+              <w:fldChar w:fldCharType="separate"/>
+            </w:r>
+            <w:r>
+              <w:rPr>
+                <w:noProof/>
+                <w:webHidden/>
+              </w:rPr>
+              <w:t>7</w:t>
+            </w:r>
+            <w:r>
+              <w:rPr>
+                <w:noProof/>
+                <w:webHidden/>
+              </w:rPr>
+              <w:fldChar w:fldCharType="end"/>
+            </w:r>
+          </w:hyperlink>
+        </w:p>
+        <w:p>
+          <w:pPr>
+            <w:pStyle w:val="TOC2"/>
+            <w:tabs>
+              <w:tab w:val="right" w:leader="dot" w:pos="9350"/>
+            </w:tabs>
+            <w:rPr>
+              <w:noProof/>
+            </w:rPr>
+          </w:pPr>
+          <w:hyperlink w:anchor="_Toc241675066" w:history="1">
+            <w:r>
+              <w:rPr>
+                <w:rStyle w:val="Hyperlink"/>
+                <w:noProof/>
+              </w:rPr>
+              <w:t>5.5 Run the Pointer Program</w:t>
+            </w:r>
+            <w:r>
+              <w:rPr>
+                <w:noProof/>
+                <w:webHidden/>
+              </w:rPr>
+              <w:tab/>
+            </w:r>
+            <w:r>
+              <w:rPr>
+                <w:noProof/>
+                <w:webHidden/>
+              </w:rPr>
+              <w:fldChar w:fldCharType="begin"/>
+            </w:r>
+            <w:r>
+              <w:rPr>
+                <w:noProof/>
+                <w:webHidden/>
+              </w:rPr>
+              <w:instrText xml:space="preserve"> PAGEREF _Toc241675066 \h </w:instrText>
+            </w:r>
+            <w:r>
+              <w:rPr>
+                <w:noProof/>
+                <w:webHidden/>
+              </w:rPr>
+            </w:r>
+            <w:r>
+              <w:rPr>
+                <w:noProof/>
+                <w:webHidden/>
+              </w:rPr>
+              <w:fldChar w:fldCharType="separate"/>
+            </w:r>
+            <w:r>
+              <w:rPr>
+                <w:noProof/>
+                <w:webHidden/>
+              </w:rPr>
+              <w:t>7</w:t>
+            </w:r>
+            <w:r>
+              <w:rPr>
+                <w:noProof/>
+                <w:webHidden/>
+              </w:rPr>
+              <w:fldChar w:fldCharType="end"/>
+            </w:r>
+          </w:hyperlink>
+        </w:p>
+        <w:p>
+          <w:pPr>
+            <w:pStyle w:val="TOC1"/>
+            <w:tabs>
+              <w:tab w:val="right" w:leader="dot" w:pos="9350"/>
+            </w:tabs>
+            <w:rPr>
+              <w:noProof/>
+            </w:rPr>
+          </w:pPr>
+          <w:hyperlink w:anchor="_Toc241675067" w:history="1">
+            <w:r>
+              <w:rPr>
+                <w:rStyle w:val="Hyperlink"/>
+                <w:noProof/>
+              </w:rPr>
+              <w:t>6. Experiment 3: Process Memory Segments</w:t>
+            </w:r>
+            <w:r>
+              <w:rPr>
+                <w:noProof/>
+                <w:webHidden/>
+              </w:rPr>
+              <w:tab/>
+            </w:r>
+            <w:r>
+              <w:rPr>
+                <w:noProof/>
+                <w:webHidden/>
+              </w:rPr>
+              <w:fldChar w:fldCharType="begin"/>
+            </w:r>
+            <w:r>
+              <w:rPr>
+                <w:noProof/>
+                <w:webHidden/>
+              </w:rPr>
+              <w:instrText xml:space="preserve"> PAGEREF _Toc241675067 \h </w:instrText>
+            </w:r>
+            <w:r>
+              <w:rPr>
+                <w:noProof/>
+                <w:webHidden/>
+              </w:rPr>
+            </w:r>
+            <w:r>
+              <w:rPr>
+                <w:noProof/>
+                <w:webHidden/>
+              </w:rPr>
+              <w:fldChar w:fldCharType="separate"/>
+            </w:r>
+            <w:r>
+              <w:rPr>
+                <w:noProof/>
+                <w:webHidden/>
+              </w:rPr>
+              <w:t>7</w:t>
+            </w:r>
+            <w:r>
+              <w:rPr>
+                <w:noProof/>
+                <w:webHidden/>
+              </w:rPr>
+              <w:fldChar w:fldCharType="end"/>
+            </w:r>
+          </w:hyperlink>
+        </w:p>
+        <w:p>
+          <w:pPr>
+            <w:pStyle w:val="TOC2"/>
+            <w:tabs>
+              <w:tab w:val="right" w:leader="dot" w:pos="9350"/>
+            </w:tabs>
+            <w:rPr>
+              <w:noProof/>
+            </w:rPr>
+          </w:pPr>
+          <w:hyperlink w:anchor="_Toc241675068" w:history="1">
+            <w:r>
+              <w:rPr>
+                <w:rStyle w:val="Hyperlink"/>
+                <w:noProof/>
+              </w:rPr>
+              <w:t>6.1 Create the Memory Segment Program</w:t>
+            </w:r>
+            <w:r>
+              <w:rPr>
+                <w:noProof/>
+                <w:webHidden/>
+              </w:rPr>
+              <w:tab/>
+            </w:r>
+            <w:r>
+              <w:rPr>
+                <w:noProof/>
+                <w:webHidden/>
+              </w:rPr>
+              <w:fldChar w:fldCharType="begin"/>
+            </w:r>
+            <w:r>
+              <w:rPr>
+                <w:noProof/>
+                <w:webHidden/>
+              </w:rPr>
+              <w:instrText xml:space="preserve"> PAGEREF _Toc241675068 \h </w:instrText>
+            </w:r>
+            <w:r>
+              <w:rPr>
+                <w:noProof/>
+                <w:webHidden/>
+              </w:rPr>
+            </w:r>
+            <w:r>
+              <w:rPr>
+                <w:noProof/>
+                <w:webHidden/>
+              </w:rPr>
+              <w:fldChar w:fldCharType="separate"/>
+            </w:r>
+            <w:r>
+              <w:rPr>
+                <w:noProof/>
+                <w:webHidden/>
+              </w:rPr>
+              <w:t>7</w:t>
+            </w:r>
+            <w:r>
+              <w:rPr>
+                <w:noProof/>
+                <w:webHidden/>
+              </w:rPr>
+              <w:fldChar w:fldCharType="end"/>
+            </w:r>
+          </w:hyperlink>
+        </w:p>
+        <w:p>
+          <w:pPr>
+            <w:pStyle w:val="TOC2"/>
+            <w:tabs>
+              <w:tab w:val="right" w:leader="dot" w:pos="9350"/>
+            </w:tabs>
+            <w:rPr>
+              <w:noProof/>
+            </w:rPr>
+          </w:pPr>
+          <w:hyperlink w:anchor="_Toc241675069" w:history="1">
+            <w:r>
+              <w:rPr>
+                <w:rStyle w:val="Hyperlink"/>
+                <w:noProof/>
+              </w:rPr>
+              <w:t>6.2 View the Source Code</w:t>
+            </w:r>
+            <w:r>
+              <w:rPr>
+                <w:noProof/>
+                <w:webHidden/>
+              </w:rPr>
+              <w:tab/>
+            </w:r>
+            <w:r>
+              <w:rPr>
+                <w:noProof/>
+                <w:webHidden/>
+              </w:rPr>
+              <w:fldChar w:fldCharType="begin"/>
+            </w:r>
+            <w:r>
+              <w:rPr>
+                <w:noProof/>
+                <w:webHidden/>
+              </w:rPr>
+              <w:instrText xml:space="preserve"> PAGEREF _Toc241675069 \h </w:instrText>
+            </w:r>
+            <w:r>
+              <w:rPr>
+                <w:noProof/>
+                <w:webHidden/>
+              </w:rPr>
+            </w:r>
+            <w:r>
+              <w:rPr>
+                <w:noProof/>
+                <w:webHidden/>
+              </w:rPr>
+              <w:fldChar w:fldCharType="separate"/>
+            </w:r>
+            <w:r>
+              <w:rPr>
+                <w:noProof/>
+                <w:webHidden/>
+              </w:rPr>
+              <w:t>8</w:t>
+            </w:r>
+            <w:r>
+              <w:rPr>
+                <w:noProof/>
+                <w:webHidden/>
+              </w:rPr>
+              <w:fldChar w:fldCharType="end"/>
+            </w:r>
+          </w:hyperlink>
+        </w:p>
+        <w:p>
+          <w:pPr>
+            <w:pStyle w:val="TOC2"/>
+            <w:tabs>
+              <w:tab w:val="right" w:leader="dot" w:pos="9350"/>
+            </w:tabs>
+            <w:rPr>
+              <w:noProof/>
+            </w:rPr>
+          </w:pPr>
+          <w:hyperlink w:anchor="_Toc241675070" w:history="1">
+            <w:r>
+              <w:rPr>
+                <w:rStyle w:val="Hyperlink"/>
+                <w:noProof/>
+              </w:rPr>
+              <w:t>6.3</w:t>
+            </w:r>
+            <w:r>
+              <w:rPr>
+                <w:rStyle w:val="Hyperlink"/>
+                <w:b/>
+                <w:bCs/>
+                <w:noProof/>
+              </w:rPr>
+              <w:t xml:space="preserve"> </w:t>
+            </w:r>
+            <w:r>
+              <w:rPr>
+                <w:rStyle w:val="Hyperlink"/>
+                <w:noProof/>
+              </w:rPr>
+              <w:t>Compile the Program</w:t>
+            </w:r>
+            <w:r>
+              <w:rPr>
+                <w:noProof/>
+                <w:webHidden/>
+              </w:rPr>
+              <w:tab/>
+            </w:r>
+            <w:r>
+              <w:rPr>
+                <w:noProof/>
+                <w:webHidden/>
+              </w:rPr>
+              <w:fldChar w:fldCharType="begin"/>
+            </w:r>
+            <w:r>
+              <w:rPr>
+                <w:noProof/>
+                <w:webHidden/>
+              </w:rPr>
+              <w:instrText xml:space="preserve"> PAGEREF _Toc241675070 \h </w:instrText>
+            </w:r>
+            <w:r>
+              <w:rPr>
+                <w:noProof/>
+                <w:webHidden/>
+              </w:rPr>
+            </w:r>
+            <w:r>
+              <w:rPr>
+                <w:noProof/>
+                <w:webHidden/>
+              </w:rPr>
+              <w:fldChar w:fldCharType="separate"/>
+            </w:r>
+            <w:r>
+              <w:rPr>
+                <w:noProof/>
+                <w:webHidden/>
+              </w:rPr>
+              <w:t>9</w:t>
+            </w:r>
+            <w:r>
+              <w:rPr>
+                <w:noProof/>
+                <w:webHidden/>
+              </w:rPr>
+              <w:fldChar w:fldCharType="end"/>
+            </w:r>
+          </w:hyperlink>
+        </w:p>
+        <w:p>
+          <w:pPr>
+            <w:pStyle w:val="TOC2"/>
+            <w:tabs>
+              <w:tab w:val="right" w:leader="dot" w:pos="9350"/>
+            </w:tabs>
+            <w:rPr>
+              <w:noProof/>
+            </w:rPr>
+          </w:pPr>
+          <w:hyperlink w:anchor="_Toc241675071" w:history="1">
+            <w:r>
+              <w:rPr>
+                <w:rStyle w:val="Hyperlink"/>
+                <w:noProof/>
+              </w:rPr>
+              <w:t>6.4 Run the Memory Segment Program</w:t>
+            </w:r>
+            <w:r>
+              <w:rPr>
+                <w:noProof/>
+                <w:webHidden/>
+              </w:rPr>
+              <w:tab/>
+            </w:r>
+            <w:r>
+              <w:rPr>
+                <w:noProof/>
+                <w:webHidden/>
+              </w:rPr>
+              <w:fldChar w:fldCharType="begin"/>
+            </w:r>
+            <w:r>
+              <w:rPr>
+                <w:noProof/>
+                <w:webHidden/>
+              </w:rPr>
+              <w:instrText xml:space="preserve"> PAGEREF _Toc241675071 \h </w:instrText>
+            </w:r>
+            <w:r>
+              <w:rPr>
+                <w:noProof/>
+                <w:webHidden/>
+              </w:rPr>
+            </w:r>
+            <w:r>
+              <w:rPr>
+                <w:noProof/>
+                <w:webHidden/>
+              </w:rPr>
+              <w:fldChar w:fldCharType="separate"/>
+            </w:r>
+            <w:r>
+              <w:rPr>
+                <w:noProof/>
+                <w:webHidden/>
+              </w:rPr>
+              <w:t>10</w:t>
+            </w:r>
+            <w:r>
+              <w:rPr>
+                <w:noProof/>
+                <w:webHidden/>
+              </w:rPr>
+              <w:fldChar w:fldCharType="end"/>
+            </w:r>
+          </w:hyperlink>
+        </w:p>
+        <w:p>
+          <w:pPr>
+            <w:pStyle w:val="TOC1"/>
+            <w:tabs>
+              <w:tab w:val="right" w:leader="dot" w:pos="9350"/>
+            </w:tabs>
+            <w:rPr>
+              <w:noProof/>
+            </w:rPr>
+          </w:pPr>
+          <w:hyperlink w:anchor="_Toc241675072" w:history="1">
+            <w:r>
+              <w:rPr>
+                <w:rStyle w:val="Hyperlink"/>
+                <w:noProof/>
+              </w:rPr>
+              <w:t>7. Explanation of the Memory Areas</w:t>
+            </w:r>
+            <w:r>
+              <w:rPr>
+                <w:noProof/>
+                <w:webHidden/>
+              </w:rPr>
+              <w:tab/>
+            </w:r>
+            <w:r>
+              <w:rPr>
+                <w:noProof/>
+                <w:webHidden/>
+              </w:rPr>
+              <w:fldChar w:fldCharType="begin"/>
+            </w:r>
+            <w:r>
+              <w:rPr>
+                <w:noProof/>
+                <w:webHidden/>
+              </w:rPr>
+              <w:instrText xml:space="preserve"> PAGEREF _Toc241675072 \h </w:instrText>
+            </w:r>
+            <w:r>
+              <w:rPr>
+                <w:noProof/>
+                <w:webHidden/>
+              </w:rPr>
+            </w:r>
+            <w:r>
+              <w:rPr>
+                <w:noProof/>
+                <w:webHidden/>
+              </w:rPr>
+              <w:fldChar w:fldCharType="separate"/>
+            </w:r>
+            <w:r>
+              <w:rPr>
+                <w:noProof/>
+                <w:webHidden/>
+              </w:rPr>
+              <w:t>11</w:t>
+            </w:r>
+            <w:r>
+              <w:rPr>
+                <w:noProof/>
+                <w:webHidden/>
+              </w:rPr>
+              <w:fldChar w:fldCharType="end"/>
+            </w:r>
+          </w:hyperlink>
+        </w:p>
+        <w:p>
+          <w:pPr>
+            <w:pStyle w:val="TOC1"/>
+            <w:tabs>
+              <w:tab w:val="right" w:leader="dot" w:pos="9350"/>
+            </w:tabs>
+            <w:rPr>
+              <w:noProof/>
+            </w:rPr>
+          </w:pPr>
+          <w:hyperlink w:anchor="_Toc241675073" w:history="1">
+            <w:r>
+              <w:rPr>
+                <w:rStyle w:val="Hyperlink"/>
+                <w:noProof/>
+              </w:rPr>
+              <w:t>8. Conclusion</w:t>
+            </w:r>
+            <w:r>
+              <w:rPr>
+                <w:noProof/>
+                <w:webHidden/>
+              </w:rPr>
+              <w:tab/>
+            </w:r>
+            <w:r>
+              <w:rPr>
+                <w:noProof/>
+                <w:webHidden/>
+              </w:rPr>
+              <w:fldChar w:fldCharType="begin"/>
+            </w:r>
+            <w:r>
+              <w:rPr>
+                <w:noProof/>
+                <w:webHidden/>
+              </w:rPr>
+              <w:instrText xml:space="preserve"> PAGEREF _Toc241675073 \h </w:instrText>
+            </w:r>
+            <w:r>
+              <w:rPr>
+                <w:noProof/>
+                <w:webHidden/>
+              </w:rPr>
+            </w:r>
+            <w:r>
+              <w:rPr>
+                <w:noProof/>
+                <w:webHidden/>
+              </w:rPr>
+              <w:fldChar w:fldCharType="separate"/>
+            </w:r>
+            <w:r>
+              <w:rPr>
+                <w:noProof/>
+                <w:webHidden/>
+              </w:rPr>
+              <w:t>11</w:t>
+            </w:r>
+            <w:r>
+              <w:rPr>
+                <w:noProof/>
+                <w:webHidden/>
+              </w:rPr>
+              <w:fldChar w:fldCharType="end"/>
+            </w:r>
+          </w:hyperlink>
+        </w:p>
+        <w:p>
+          <w:pPr>
+            <w:pStyle w:val="TOC1"/>
+            <w:tabs>
+              <w:tab w:val="right" w:leader="dot" w:pos="9350"/>
+            </w:tabs>
+            <w:rPr>
+              <w:noProof/>
+            </w:rPr>
+          </w:pPr>
+          <w:hyperlink w:anchor="_Toc241675074" w:history="1">
+            <w:r>
+              <w:rPr>
+                <w:rStyle w:val="Hyperlink"/>
+                <w:noProof/>
+              </w:rPr>
+              <w:t>GitHub Repository</w:t>
+            </w:r>
+            <w:r>
+              <w:rPr>
+                <w:noProof/>
+                <w:webHidden/>
+              </w:rPr>
+              <w:tab/>
+            </w:r>
+            <w:r>
+              <w:rPr>
+                <w:noProof/>
+                <w:webHidden/>
+              </w:rPr>
+              <w:fldChar w:fldCharType="begin"/>
+            </w:r>
+            <w:r>
+              <w:rPr>
+                <w:noProof/>
+                <w:webHidden/>
+              </w:rPr>
+              <w:instrText xml:space="preserve"> PAGEREF _Toc241675074 \h </w:instrText>
+            </w:r>
+            <w:r>
+              <w:rPr>
+                <w:noProof/>
+                <w:webHidden/>
+              </w:rPr>
+            </w:r>
+            <w:r>
+              <w:rPr>
+                <w:noProof/>
+                <w:webHidden/>
+              </w:rPr>
+              <w:fldChar w:fldCharType="separate"/>
+            </w:r>
+            <w:r>
+              <w:rPr>
+                <w:noProof/>
+                <w:webHidden/>
+              </w:rPr>
+              <w:t>11</w:t>
+            </w:r>
+            <w:r>
+              <w:rPr>
+                <w:noProof/>
+                <w:webHidden/>
+              </w:rPr>
+              <w:fldChar w:fldCharType="end"/>
+            </w:r>
+          </w:hyperlink>
+        </w:p>
+        <w:p>
+          <w:pPr>
+            <w:rPr>
+              <w:b/>
+              <w:bCs/>
+              <w:noProof/>
+            </w:rPr>
+          </w:pPr>
+          <w:r>
+            <w:rPr>
+              <w:b/>
+              <w:bCs/>
+              <w:noProof/>
+            </w:rPr>
+            <w:fldChar w:fldCharType="end"/>
+          </w:r>
+        </w:p>
+        <w:p>
+          <w:pPr>
+            <w:rPr>
+              <w:b/>
+              <w:bCs/>
+              <w:noProof/>
+            </w:rPr>
+          </w:pPr>
+        </w:p>
+        <w:p>
+          <w:pPr>
+            <w:rPr>
+              <w:b/>
+              <w:bCs/>
+              <w:noProof/>
+            </w:rPr>
+          </w:pPr>
+        </w:p>
+        <w:p>
+          <w:pPr>
+            <w:rPr>
+              <w:b/>
+              <w:bCs/>
+              <w:noProof/>
+            </w:rPr>
+          </w:pPr>
+        </w:p>
+        <w:p/>
+      </w:sdtContent>
+    </w:sdt>
+    <w:p>
+      <w:pPr>
+        <w:rPr>
+          <w:sz w:val="40"/>
+          <w:szCs w:val="40"/>
+        </w:rPr>
+      </w:pPr>
+      <w:r>
+        <w:rPr>
+          <w:sz w:val="40"/>
+          <w:szCs w:val="40"/>
+        </w:rPr>
+        <w:lastRenderedPageBreak/>
+        <w:t>Table Of Figures</w:t>
+      </w:r>
+    </w:p>
+    <w:p>
+      <w:pPr>
+        <w:pStyle w:val="TableofFigures"/>
+        <w:tabs>
+          <w:tab w:val="right" w:leader="dot" w:pos="9350"/>
+        </w:tabs>
+        <w:rPr>
+          <w:noProof/>
+        </w:rPr>
+      </w:pPr>
+      <w:r>
+        <w:fldChar w:fldCharType="begin"/>
+      </w:r>
+      <w:r>
+        <w:instrText xml:space="preserve"> TOC \h \z \c "Figure" </w:instrText>
+      </w:r>
+      <w:r>
+        <w:fldChar w:fldCharType="separate"/>
+      </w:r>
+      <w:hyperlink w:anchor="_Toc241675075" w:history="1">
+        <w:r>
+          <w:rPr>
+            <w:rStyle w:val="Hyperlink"/>
+            <w:rFonts w:ascii="Times New Roman" w:hAnsi="Times New Roman" w:cs="Times New Roman"/>
+            <w:noProof/>
+          </w:rPr>
+          <w:t>Figure 1: Creating Data Type Program</w:t>
+        </w:r>
+        <w:r>
+          <w:rPr>
+            <w:noProof/>
+            <w:webHidden/>
+          </w:rPr>
+          <w:tab/>
+        </w:r>
+        <w:r>
+          <w:rPr>
+            <w:noProof/>
+            <w:webHidden/>
+          </w:rPr>
+          <w:fldChar w:fldCharType="begin"/>
+        </w:r>
+        <w:r>
+          <w:rPr>
+            <w:noProof/>
+            <w:webHidden/>
+          </w:rPr>
+          <w:instrText xml:space="preserve"> PAGEREF _Toc241675075 \h </w:instrText>
+        </w:r>
+        <w:r>
+          <w:rPr>
+            <w:noProof/>
+            <w:webHidden/>
+          </w:rPr>
+        </w:r>
+        <w:r>
+          <w:rPr>
+            <w:noProof/>
+            <w:webHidden/>
+          </w:rPr>
+          <w:fldChar w:fldCharType="separate"/>
+        </w:r>
+        <w:r>
+          <w:rPr>
+            <w:noProof/>
+            <w:webHidden/>
+          </w:rPr>
+          <w:t>4</w:t>
+        </w:r>
+        <w:r>
+          <w:rPr>
+            <w:noProof/>
+            <w:webHidden/>
+          </w:rPr>
+          <w:fldChar w:fldCharType="end"/>
+        </w:r>
+      </w:hyperlink>
+    </w:p>
+    <w:p>
+      <w:pPr>
+        <w:pStyle w:val="TableofFigures"/>
+        <w:tabs>
+          <w:tab w:val="right" w:leader="dot" w:pos="9350"/>
+        </w:tabs>
+        <w:rPr>
+          <w:noProof/>
+        </w:rPr>
+      </w:pPr>
+      <w:hyperlink w:anchor="_Toc241675076" w:history="1">
+        <w:r>
+          <w:rPr>
+            <w:rStyle w:val="Hyperlink"/>
+            <w:rFonts w:ascii="Times New Roman" w:hAnsi="Times New Roman" w:cs="Times New Roman"/>
+            <w:noProof/>
+          </w:rPr>
+          <w:t>Figure 2 : Displaying the contents of datatype_size.c.</w:t>
+        </w:r>
+        <w:r>
+          <w:rPr>
+            <w:noProof/>
+            <w:webHidden/>
+          </w:rPr>
+          <w:tab/>
+        </w:r>
+        <w:r>
+          <w:rPr>
+            <w:noProof/>
+            <w:webHidden/>
+          </w:rPr>
+          <w:fldChar w:fldCharType="begin"/>
+        </w:r>
+        <w:r>
+          <w:rPr>
+            <w:noProof/>
+            <w:webHidden/>
+          </w:rPr>
+          <w:instrText xml:space="preserve"> PAGEREF _Toc241675076 \h </w:instrText>
+        </w:r>
+        <w:r>
+          <w:rPr>
+            <w:noProof/>
+            <w:webHidden/>
+          </w:rPr>
+        </w:r>
+        <w:r>
+          <w:rPr>
+            <w:noProof/>
+            <w:webHidden/>
+          </w:rPr>
+          <w:fldChar w:fldCharType="separate"/>
+        </w:r>
+        <w:r>
+          <w:rPr>
+            <w:noProof/>
+            <w:webHidden/>
+          </w:rPr>
+          <w:t>4</w:t>
+        </w:r>
+        <w:r>
+          <w:rPr>
+            <w:noProof/>
+            <w:webHidden/>
+          </w:rPr>
+          <w:fldChar w:fldCharType="end"/>
+        </w:r>
+      </w:hyperlink>
+    </w:p>
+    <w:p>
+      <w:pPr>
+        <w:pStyle w:val="TableofFigures"/>
+        <w:tabs>
+          <w:tab w:val="right" w:leader="dot" w:pos="9350"/>
+        </w:tabs>
+        <w:rPr>
+          <w:noProof/>
+        </w:rPr>
+      </w:pPr>
+      <w:hyperlink w:anchor="_Toc241675077" w:history="1">
+        <w:r>
+          <w:rPr>
+            <w:rStyle w:val="Hyperlink"/>
+            <w:rFonts w:ascii="Times New Roman" w:hAnsi="Times New Roman" w:cs="Times New Roman"/>
+            <w:noProof/>
+          </w:rPr>
+          <w:t>Figure 3: Compiling the data type size program.</w:t>
+        </w:r>
+        <w:r>
+          <w:rPr>
+            <w:noProof/>
+            <w:webHidden/>
+          </w:rPr>
+          <w:tab/>
+        </w:r>
+        <w:r>
+          <w:rPr>
+            <w:noProof/>
+            <w:webHidden/>
+          </w:rPr>
+          <w:fldChar w:fldCharType="begin"/>
+        </w:r>
+        <w:r>
+          <w:rPr>
+            <w:noProof/>
+            <w:webHidden/>
+          </w:rPr>
+          <w:instrText xml:space="preserve"> PAGEREF _Toc241675077 \h </w:instrText>
+        </w:r>
+        <w:r>
+          <w:rPr>
+            <w:noProof/>
+            <w:webHidden/>
+          </w:rPr>
+        </w:r>
+        <w:r>
+          <w:rPr>
+            <w:noProof/>
+            <w:webHidden/>
+          </w:rPr>
+          <w:fldChar w:fldCharType="separate"/>
+        </w:r>
+        <w:r>
+          <w:rPr>
+            <w:noProof/>
+            <w:webHidden/>
+          </w:rPr>
+          <w:t>5</w:t>
+        </w:r>
+        <w:r>
+          <w:rPr>
+            <w:noProof/>
+            <w:webHidden/>
+          </w:rPr>
+          <w:fldChar w:fldCharType="end"/>
+        </w:r>
+      </w:hyperlink>
+    </w:p>
+    <w:p>
+      <w:pPr>
+        <w:pStyle w:val="TableofFigures"/>
+        <w:tabs>
+          <w:tab w:val="right" w:leader="dot" w:pos="9350"/>
+        </w:tabs>
+        <w:rPr>
+          <w:noProof/>
+        </w:rPr>
+      </w:pPr>
+      <w:hyperlink w:anchor="_Toc241675078" w:history="1">
+        <w:r>
+          <w:rPr>
+            <w:rStyle w:val="Hyperlink"/>
+            <w:rFonts w:ascii="Times New Roman" w:hAnsi="Times New Roman" w:cs="Times New Roman"/>
+            <w:noProof/>
+          </w:rPr>
+          <w:t>Figure 4: Executing the data type size program and displaying the output.</w:t>
+        </w:r>
+        <w:r>
+          <w:rPr>
+            <w:noProof/>
+            <w:webHidden/>
+          </w:rPr>
+          <w:tab/>
+        </w:r>
+        <w:r>
+          <w:rPr>
+            <w:noProof/>
+            <w:webHidden/>
+          </w:rPr>
+          <w:fldChar w:fldCharType="begin"/>
+        </w:r>
+        <w:r>
+          <w:rPr>
+            <w:noProof/>
+            <w:webHidden/>
+          </w:rPr>
+          <w:instrText xml:space="preserve"> PAGEREF _Toc241675078 \h </w:instrText>
+        </w:r>
+        <w:r>
+          <w:rPr>
+            <w:noProof/>
+            <w:webHidden/>
+          </w:rPr>
+        </w:r>
+        <w:r>
+          <w:rPr>
+            <w:noProof/>
+            <w:webHidden/>
+          </w:rPr>
+          <w:fldChar w:fldCharType="separate"/>
+        </w:r>
+        <w:r>
+          <w:rPr>
+            <w:noProof/>
+            <w:webHidden/>
+          </w:rPr>
+          <w:t>5</w:t>
+        </w:r>
+        <w:r>
+          <w:rPr>
+            <w:noProof/>
+            <w:webHidden/>
+          </w:rPr>
+          <w:fldChar w:fldCharType="end"/>
+        </w:r>
+      </w:hyperlink>
+    </w:p>
+    <w:p>
+      <w:pPr>
+        <w:pStyle w:val="TableofFigures"/>
+        <w:tabs>
+          <w:tab w:val="right" w:leader="dot" w:pos="9350"/>
+        </w:tabs>
+        <w:rPr>
+          <w:noProof/>
+        </w:rPr>
+      </w:pPr>
+      <w:hyperlink w:anchor="_Toc241675079" w:history="1">
+        <w:r>
+          <w:rPr>
+            <w:rStyle w:val="Hyperlink"/>
+            <w:rFonts w:ascii="Times New Roman" w:hAnsi="Times New Roman" w:cs="Times New Roman"/>
+            <w:noProof/>
+          </w:rPr>
+          <w:t>Figure 5: Listing the source file and compiled executable.</w:t>
+        </w:r>
+        <w:r>
+          <w:rPr>
+            <w:noProof/>
+            <w:webHidden/>
+          </w:rPr>
+          <w:tab/>
+        </w:r>
+        <w:r>
+          <w:rPr>
+            <w:noProof/>
+            <w:webHidden/>
+          </w:rPr>
+          <w:fldChar w:fldCharType="begin"/>
+        </w:r>
+        <w:r>
+          <w:rPr>
+            <w:noProof/>
+            <w:webHidden/>
+          </w:rPr>
+          <w:instrText xml:space="preserve"> PAGEREF _Toc241675079 \h </w:instrText>
+        </w:r>
+        <w:r>
+          <w:rPr>
+            <w:noProof/>
+            <w:webHidden/>
+          </w:rPr>
+        </w:r>
+        <w:r>
+          <w:rPr>
+            <w:noProof/>
+            <w:webHidden/>
+          </w:rPr>
+          <w:fldChar w:fldCharType="separate"/>
+        </w:r>
+        <w:r>
+          <w:rPr>
+            <w:noProof/>
+            <w:webHidden/>
+          </w:rPr>
+          <w:t>6</w:t>
+        </w:r>
+        <w:r>
+          <w:rPr>
+            <w:noProof/>
+            <w:webHidden/>
+          </w:rPr>
+          <w:fldChar w:fldCharType="end"/>
+        </w:r>
+      </w:hyperlink>
+    </w:p>
+    <w:p>
+      <w:pPr>
+        <w:pStyle w:val="TableofFigures"/>
+        <w:tabs>
+          <w:tab w:val="right" w:leader="dot" w:pos="9350"/>
+        </w:tabs>
+        <w:rPr>
+          <w:noProof/>
+        </w:rPr>
+      </w:pPr>
+      <w:hyperlink w:anchor="_Toc241675080" w:history="1">
+        <w:r>
+          <w:rPr>
+            <w:rStyle w:val="Hyperlink"/>
+            <w:rFonts w:ascii="Times New Roman" w:hAnsi="Times New Roman" w:cs="Times New Roman"/>
+            <w:noProof/>
+          </w:rPr>
+          <w:t>Figure 6: Creating the pointer_memory.c source file.</w:t>
+        </w:r>
+        <w:r>
+          <w:rPr>
+            <w:noProof/>
+            <w:webHidden/>
+          </w:rPr>
+          <w:tab/>
+        </w:r>
+        <w:r>
+          <w:rPr>
+            <w:noProof/>
+            <w:webHidden/>
+          </w:rPr>
+          <w:fldChar w:fldCharType="begin"/>
+        </w:r>
+        <w:r>
+          <w:rPr>
+            <w:noProof/>
+            <w:webHidden/>
+          </w:rPr>
+          <w:instrText xml:space="preserve"> PAGEREF _Toc241675080 \h </w:instrText>
+        </w:r>
+        <w:r>
+          <w:rPr>
+            <w:noProof/>
+            <w:webHidden/>
+          </w:rPr>
+        </w:r>
+        <w:r>
+          <w:rPr>
+            <w:noProof/>
+            <w:webHidden/>
+          </w:rPr>
+          <w:fldChar w:fldCharType="separate"/>
+        </w:r>
+        <w:r>
+          <w:rPr>
+            <w:noProof/>
+            <w:webHidden/>
+          </w:rPr>
+          <w:t>6</w:t>
+        </w:r>
+        <w:r>
+          <w:rPr>
+            <w:noProof/>
+            <w:webHidden/>
+          </w:rPr>
+          <w:fldChar w:fldCharType="end"/>
+        </w:r>
+      </w:hyperlink>
+    </w:p>
+    <w:p>
+      <w:pPr>
+        <w:pStyle w:val="TableofFigures"/>
+        <w:tabs>
+          <w:tab w:val="right" w:leader="dot" w:pos="9350"/>
+        </w:tabs>
+        <w:rPr>
+          <w:noProof/>
+        </w:rPr>
+      </w:pPr>
+      <w:hyperlink w:anchor="_Toc241675081" w:history="1">
+        <w:r>
+          <w:rPr>
+            <w:rStyle w:val="Hyperlink"/>
+            <w:rFonts w:ascii="Times New Roman" w:hAnsi="Times New Roman" w:cs="Times New Roman"/>
+            <w:noProof/>
+          </w:rPr>
+          <w:t>Figure 7: Listing the files in the Lab4 directory.</w:t>
+        </w:r>
+        <w:r>
+          <w:rPr>
+            <w:noProof/>
+            <w:webHidden/>
+          </w:rPr>
+          <w:tab/>
+        </w:r>
+        <w:r>
+          <w:rPr>
+            <w:noProof/>
+            <w:webHidden/>
+          </w:rPr>
+          <w:fldChar w:fldCharType="begin"/>
+        </w:r>
+        <w:r>
+          <w:rPr>
+            <w:noProof/>
+            <w:webHidden/>
+          </w:rPr>
+          <w:instrText xml:space="preserve"> PAGEREF _Toc241675081 \h </w:instrText>
+        </w:r>
+        <w:r>
+          <w:rPr>
+            <w:noProof/>
+            <w:webHidden/>
+          </w:rPr>
+        </w:r>
+        <w:r>
+          <w:rPr>
+            <w:noProof/>
+            <w:webHidden/>
+          </w:rPr>
+          <w:fldChar w:fldCharType="separate"/>
+        </w:r>
+        <w:r>
+          <w:rPr>
+            <w:noProof/>
+            <w:webHidden/>
+          </w:rPr>
+          <w:t>6</w:t>
+        </w:r>
+        <w:r>
+          <w:rPr>
+            <w:noProof/>
+            <w:webHidden/>
+          </w:rPr>
+          <w:fldChar w:fldCharType="end"/>
+        </w:r>
+      </w:hyperlink>
+    </w:p>
+    <w:p>
+      <w:pPr>
+        <w:pStyle w:val="TableofFigures"/>
+        <w:tabs>
+          <w:tab w:val="right" w:leader="dot" w:pos="9350"/>
+        </w:tabs>
+        <w:rPr>
+          <w:noProof/>
+        </w:rPr>
+      </w:pPr>
+      <w:hyperlink w:anchor="_Toc241675082" w:history="1">
+        <w:r>
+          <w:rPr>
+            <w:rStyle w:val="Hyperlink"/>
+            <w:rFonts w:ascii="Times New Roman" w:hAnsi="Times New Roman" w:cs="Times New Roman"/>
+            <w:noProof/>
+          </w:rPr>
+          <w:t>Figure 8: Displaying the contents of pointer_memory.c.</w:t>
+        </w:r>
+        <w:r>
+          <w:rPr>
+            <w:noProof/>
+            <w:webHidden/>
+          </w:rPr>
+          <w:tab/>
+        </w:r>
+        <w:r>
+          <w:rPr>
+            <w:noProof/>
+            <w:webHidden/>
+          </w:rPr>
+          <w:fldChar w:fldCharType="begin"/>
+        </w:r>
+        <w:r>
+          <w:rPr>
+            <w:noProof/>
+            <w:webHidden/>
+          </w:rPr>
+          <w:instrText xml:space="preserve"> PAGEREF _Toc241675082 \h </w:instrText>
+        </w:r>
+        <w:r>
+          <w:rPr>
+            <w:noProof/>
+            <w:webHidden/>
+          </w:rPr>
+        </w:r>
+        <w:r>
+          <w:rPr>
+            <w:noProof/>
+            <w:webHidden/>
+          </w:rPr>
+          <w:fldChar w:fldCharType="separate"/>
+        </w:r>
+        <w:r>
+          <w:rPr>
+            <w:noProof/>
+            <w:webHidden/>
+          </w:rPr>
+          <w:t>7</w:t>
+        </w:r>
+        <w:r>
+          <w:rPr>
+            <w:noProof/>
+            <w:webHidden/>
+          </w:rPr>
+          <w:fldChar w:fldCharType="end"/>
+        </w:r>
+      </w:hyperlink>
+    </w:p>
+    <w:p>
+      <w:pPr>
+        <w:pStyle w:val="TableofFigures"/>
+        <w:tabs>
+          <w:tab w:val="right" w:leader="dot" w:pos="9350"/>
+        </w:tabs>
+        <w:rPr>
+          <w:noProof/>
+        </w:rPr>
+      </w:pPr>
+      <w:hyperlink w:anchor="_Toc241675083" w:history="1">
+        <w:r>
+          <w:rPr>
+            <w:rStyle w:val="Hyperlink"/>
+            <w:rFonts w:ascii="Times New Roman" w:hAnsi="Times New Roman" w:cs="Times New Roman"/>
+            <w:noProof/>
+          </w:rPr>
+          <w:t>Figure 9: Compiling the pointer and dynamic memory program.</w:t>
+        </w:r>
+        <w:r>
+          <w:rPr>
+            <w:noProof/>
+            <w:webHidden/>
+          </w:rPr>
+          <w:tab/>
+        </w:r>
+        <w:r>
+          <w:rPr>
+            <w:noProof/>
+            <w:webHidden/>
+          </w:rPr>
+          <w:fldChar w:fldCharType="begin"/>
+        </w:r>
+        <w:r>
+          <w:rPr>
+            <w:noProof/>
+            <w:webHidden/>
+          </w:rPr>
+          <w:instrText xml:space="preserve"> PAGEREF _Toc241675083 \h </w:instrText>
+        </w:r>
+        <w:r>
+          <w:rPr>
+            <w:noProof/>
+            <w:webHidden/>
+          </w:rPr>
+        </w:r>
+        <w:r>
+          <w:rPr>
+            <w:noProof/>
+            <w:webHidden/>
+          </w:rPr>
+          <w:fldChar w:fldCharType="separate"/>
+        </w:r>
+        <w:r>
+          <w:rPr>
+            <w:noProof/>
+            <w:webHidden/>
+          </w:rPr>
+          <w:t>8</w:t>
+        </w:r>
+        <w:r>
+          <w:rPr>
+            <w:noProof/>
+            <w:webHidden/>
+          </w:rPr>
+          <w:fldChar w:fldCharType="end"/>
+        </w:r>
+      </w:hyperlink>
+    </w:p>
+    <w:p>
+      <w:pPr>
+        <w:pStyle w:val="TableofFigures"/>
+        <w:tabs>
+          <w:tab w:val="right" w:leader="dot" w:pos="9350"/>
+        </w:tabs>
+        <w:rPr>
+          <w:noProof/>
+        </w:rPr>
+      </w:pPr>
+      <w:hyperlink w:anchor="_Toc241675084" w:history="1">
+        <w:r>
+          <w:rPr>
+            <w:rStyle w:val="Hyperlink"/>
+            <w:rFonts w:ascii="Times New Roman" w:hAnsi="Times New Roman" w:cs="Times New Roman"/>
+            <w:noProof/>
+          </w:rPr>
+          <w:t>Figure 10: Executing the pointer and dynamic memory program.</w:t>
+        </w:r>
+        <w:r>
+          <w:rPr>
+            <w:noProof/>
+            <w:webHidden/>
+          </w:rPr>
+          <w:tab/>
+        </w:r>
+        <w:r>
+          <w:rPr>
+            <w:noProof/>
+            <w:webHidden/>
+          </w:rPr>
+          <w:fldChar w:fldCharType="begin"/>
+        </w:r>
+        <w:r>
+          <w:rPr>
+            <w:noProof/>
+            <w:webHidden/>
+          </w:rPr>
+          <w:instrText xml:space="preserve"> PAGEREF _Toc241675084 \h </w:instrText>
+        </w:r>
+        <w:r>
+          <w:rPr>
+            <w:noProof/>
+            <w:webHidden/>
+          </w:rPr>
+        </w:r>
+        <w:r>
+          <w:rPr>
+            <w:noProof/>
+            <w:webHidden/>
+          </w:rPr>
+          <w:fldChar w:fldCharType="separate"/>
+        </w:r>
+        <w:r>
+          <w:rPr>
+            <w:noProof/>
+            <w:webHidden/>
+          </w:rPr>
+          <w:t>8</w:t>
+        </w:r>
+        <w:r>
+          <w:rPr>
+            <w:noProof/>
+            <w:webHidden/>
+          </w:rPr>
+          <w:fldChar w:fldCharType="end"/>
+        </w:r>
+      </w:hyperlink>
+    </w:p>
+    <w:p>
+      <w:pPr>
+        <w:pStyle w:val="TableofFigures"/>
+        <w:tabs>
+          <w:tab w:val="right" w:leader="dot" w:pos="9350"/>
+        </w:tabs>
+        <w:rPr>
+          <w:noProof/>
+        </w:rPr>
+      </w:pPr>
+      <w:hyperlink w:anchor="_Toc241675085" w:history="1">
+        <w:r>
+          <w:rPr>
+            <w:rStyle w:val="Hyperlink"/>
+            <w:rFonts w:ascii="Times New Roman" w:hAnsi="Times New Roman" w:cs="Times New Roman"/>
+            <w:noProof/>
+          </w:rPr>
+          <w:t>Figure 11: Creating the memory_segments.c source file.</w:t>
+        </w:r>
+        <w:r>
+          <w:rPr>
+            <w:noProof/>
+            <w:webHidden/>
+          </w:rPr>
+          <w:tab/>
+        </w:r>
+        <w:r>
+          <w:rPr>
+            <w:noProof/>
+            <w:webHidden/>
+          </w:rPr>
+          <w:fldChar w:fldCharType="begin"/>
+        </w:r>
+        <w:r>
+          <w:rPr>
+            <w:noProof/>
+            <w:webHidden/>
+          </w:rPr>
+          <w:instrText xml:space="preserve"> PAGEREF _Toc241675085 \h </w:instrText>
+        </w:r>
+        <w:r>
+          <w:rPr>
+            <w:noProof/>
+            <w:webHidden/>
+          </w:rPr>
+        </w:r>
+        <w:r>
+          <w:rPr>
+            <w:noProof/>
+            <w:webHidden/>
+          </w:rPr>
+          <w:fldChar w:fldCharType="separate"/>
+        </w:r>
+        <w:r>
+          <w:rPr>
+            <w:noProof/>
+            <w:webHidden/>
+          </w:rPr>
+          <w:t>9</w:t>
+        </w:r>
+        <w:r>
+          <w:rPr>
+            <w:noProof/>
+            <w:webHidden/>
+          </w:rPr>
+          <w:fldChar w:fldCharType="end"/>
+        </w:r>
+      </w:hyperlink>
+    </w:p>
+    <w:p>
+      <w:pPr>
+        <w:pStyle w:val="TableofFigures"/>
+        <w:tabs>
+          <w:tab w:val="right" w:leader="dot" w:pos="9350"/>
+        </w:tabs>
+        <w:rPr>
+          <w:noProof/>
+        </w:rPr>
+      </w:pPr>
+      <w:hyperlink w:anchor="_Toc241675086" w:history="1">
+        <w:r>
+          <w:rPr>
+            <w:rStyle w:val="Hyperlink"/>
+            <w:rFonts w:ascii="Times New Roman" w:hAnsi="Times New Roman" w:cs="Times New Roman"/>
+            <w:noProof/>
+          </w:rPr>
+          <w:t>Figure 12:Displaying the contents of memory_segments.c.</w:t>
+        </w:r>
+        <w:r>
+          <w:rPr>
+            <w:noProof/>
+            <w:webHidden/>
+          </w:rPr>
+          <w:tab/>
+        </w:r>
+        <w:r>
+          <w:rPr>
+            <w:noProof/>
+            <w:webHidden/>
+          </w:rPr>
+          <w:fldChar w:fldCharType="begin"/>
+        </w:r>
+        <w:r>
+          <w:rPr>
+            <w:noProof/>
+            <w:webHidden/>
+          </w:rPr>
+          <w:instrText xml:space="preserve"> PAGEREF _Toc241675086 \h </w:instrText>
+        </w:r>
+        <w:r>
+          <w:rPr>
+            <w:noProof/>
+            <w:webHidden/>
+          </w:rPr>
+        </w:r>
+        <w:r>
+          <w:rPr>
+            <w:noProof/>
+            <w:webHidden/>
+          </w:rPr>
+          <w:fldChar w:fldCharType="separate"/>
+        </w:r>
+        <w:r>
+          <w:rPr>
+            <w:noProof/>
+            <w:webHidden/>
+          </w:rPr>
+          <w:t>10</w:t>
+        </w:r>
+        <w:r>
+          <w:rPr>
+            <w:noProof/>
+            <w:webHidden/>
+          </w:rPr>
+          <w:fldChar w:fldCharType="end"/>
+        </w:r>
+      </w:hyperlink>
+    </w:p>
+    <w:p>
+      <w:pPr>
+        <w:pStyle w:val="TableofFigures"/>
+        <w:tabs>
+          <w:tab w:val="right" w:leader="dot" w:pos="9350"/>
+        </w:tabs>
+        <w:rPr>
+          <w:noProof/>
+        </w:rPr>
+      </w:pPr>
+      <w:hyperlink w:anchor="_Toc241675087" w:history="1">
+        <w:r>
+          <w:rPr>
+            <w:rStyle w:val="Hyperlink"/>
+            <w:rFonts w:ascii="Times New Roman" w:hAnsi="Times New Roman" w:cs="Times New Roman"/>
+            <w:noProof/>
+          </w:rPr>
+          <w:t>Figure 13:Compiling the memory segment program.</w:t>
+        </w:r>
+        <w:r>
+          <w:rPr>
+            <w:noProof/>
+            <w:webHidden/>
+          </w:rPr>
+          <w:tab/>
+        </w:r>
+        <w:r>
+          <w:rPr>
+            <w:noProof/>
+            <w:webHidden/>
+          </w:rPr>
+          <w:fldChar w:fldCharType="begin"/>
+        </w:r>
+        <w:r>
+          <w:rPr>
+            <w:noProof/>
+            <w:webHidden/>
+          </w:rPr>
+          <w:instrText xml:space="preserve"> PAGEREF _Toc241675087 \h </w:instrText>
+        </w:r>
+        <w:r>
+          <w:rPr>
+            <w:noProof/>
+            <w:webHidden/>
+          </w:rPr>
+        </w:r>
+        <w:r>
+          <w:rPr>
+            <w:noProof/>
+            <w:webHidden/>
+          </w:rPr>
+          <w:fldChar w:fldCharType="separate"/>
+        </w:r>
+        <w:r>
+          <w:rPr>
+            <w:noProof/>
+            <w:webHidden/>
+          </w:rPr>
+          <w:t>11</w:t>
+        </w:r>
+        <w:r>
+          <w:rPr>
+            <w:noProof/>
+            <w:webHidden/>
+          </w:rPr>
+          <w:fldChar w:fldCharType="end"/>
+        </w:r>
+      </w:hyperlink>
+    </w:p>
+    <w:p>
+      <w:pPr>
+        <w:pStyle w:val="TableofFigures"/>
+        <w:tabs>
+          <w:tab w:val="right" w:leader="dot" w:pos="9350"/>
+        </w:tabs>
+      </w:pPr>
+      <w:hyperlink w:anchor="_Toc241675088" w:history="1">
+        <w:r>
+          <w:rPr>
+            <w:rStyle w:val="Hyperlink"/>
+            <w:rFonts w:ascii="Times New Roman" w:hAnsi="Times New Roman" w:cs="Times New Roman"/>
+            <w:noProof/>
+          </w:rPr>
+          <w:t>Figure 14: Displaying process memory segment addresses and variable values.</w:t>
+        </w:r>
+        <w:r>
+          <w:rPr>
+            <w:noProof/>
+            <w:webHidden/>
+          </w:rPr>
+          <w:tab/>
+        </w:r>
+        <w:r>
+          <w:rPr>
+            <w:noProof/>
+            <w:webHidden/>
+          </w:rPr>
+          <w:fldChar w:fldCharType="begin"/>
+        </w:r>
+        <w:r>
+          <w:rPr>
+            <w:noProof/>
+            <w:webHidden/>
+          </w:rPr>
+          <w:instrText xml:space="preserve"> PAGEREF _Toc241675088 \h </w:instrText>
+        </w:r>
+        <w:r>
+          <w:rPr>
+            <w:noProof/>
+            <w:webHidden/>
+          </w:rPr>
+        </w:r>
+        <w:r>
+          <w:rPr>
+            <w:noProof/>
+            <w:webHidden/>
+          </w:rPr>
+          <w:fldChar w:fldCharType="separate"/>
+        </w:r>
+        <w:r>
+          <w:rPr>
+            <w:noProof/>
+            <w:webHidden/>
+          </w:rPr>
+          <w:t>11</w:t>
+        </w:r>
+        <w:r>
+          <w:rPr>
+            <w:noProof/>
+            <w:webHidden/>
+          </w:rPr>
+          <w:fldChar w:fldCharType="end"/>
+        </w:r>
+      </w:hyperlink>
+      <w:r>
+        <w:fldChar w:fldCharType="end"/>
+      </w:r>
+    </w:p>
+    <w:p/>
+    <w:p/>
+    <w:p/>
+    <w:p/>
+    <w:p/>
+    <w:p/>
+    <w:p/>
+    <w:p/>
+    <w:p/>
+    <w:p/>
+    <w:p/>
+    <w:p/>
+    <w:p/>
     <w:p>
       <w:pPr>
         <w:pStyle w:val="Heading1"/>
       </w:pPr>
+      <w:bookmarkStart w:id="0" w:name="_Toc241675052"/>
       <w:r>
         <w:lastRenderedPageBreak/>
         <w:t>1. Introduction</w:t>
       </w:r>
+      <w:bookmarkEnd w:id="0"/>
     </w:p>
     <w:p>
       <w:pPr>
@@ -445,9 +3125,11 @@
       <w:pPr>
         <w:pStyle w:val="Heading1"/>
       </w:pPr>
+      <w:bookmarkStart w:id="1" w:name="_Toc241675053"/>
       <w:r>
         <w:t>2. Objectives</w:t>
       </w:r>
+      <w:bookmarkEnd w:id="1"/>
     </w:p>
     <w:p>
       <w:pPr>
@@ -544,9 +3226,11 @@
         <w:pStyle w:val="Heading1"/>
         <w:jc w:val="both"/>
       </w:pPr>
+      <w:bookmarkStart w:id="2" w:name="_Toc241675054"/>
       <w:r>
         <w:t>3. Tools and Environment</w:t>
       </w:r>
+      <w:bookmarkEnd w:id="2"/>
     </w:p>
     <w:p>
       <w:pPr>
@@ -690,18 +3374,22 @@
         <w:pStyle w:val="Heading1"/>
         <w:jc w:val="both"/>
       </w:pPr>
+      <w:bookmarkStart w:id="3" w:name="_Toc241675055"/>
       <w:r>
         <w:t>4. Experiment 1: Data Type Size</w:t>
       </w:r>
+      <w:bookmarkEnd w:id="3"/>
     </w:p>
     <w:p>
       <w:pPr>
         <w:pStyle w:val="Heading2"/>
         <w:jc w:val="both"/>
       </w:pPr>
+      <w:bookmarkStart w:id="4" w:name="_Toc241675056"/>
       <w:r>
         <w:t>4.1 Create the C Source File</w:t>
       </w:r>
+      <w:bookmarkEnd w:id="4"/>
     </w:p>
     <w:p>
       <w:pPr>
@@ -844,6 +3532,7 @@
         </w:rPr>
         <w:t xml:space="preserve">                                        </w:t>
       </w:r>
+      <w:bookmarkStart w:id="5" w:name="_Toc241675075"/>
       <w:r>
         <w:rPr>
           <w:rFonts w:ascii="Times New Roman" w:hAnsi="Times New Roman" w:cs="Times New Roman"/>
@@ -901,6 +3590,7 @@
         </w:rPr>
         <w:t>: Creating Data Type Program</w:t>
       </w:r>
+      <w:bookmarkEnd w:id="5"/>
     </w:p>
     <w:p>
       <w:pPr>
@@ -913,9 +3603,11 @@
       <w:pPr>
         <w:pStyle w:val="Heading2"/>
       </w:pPr>
+      <w:bookmarkStart w:id="6" w:name="_Toc241675057"/>
       <w:r>
         <w:t>4.2 Verify the C Source Code</w:t>
       </w:r>
+      <w:bookmarkEnd w:id="6"/>
     </w:p>
     <w:p>
       <w:pPr>
@@ -1032,6 +3724,7 @@
         </w:rPr>
         <w:t xml:space="preserve">                                 </w:t>
       </w:r>
+      <w:bookmarkStart w:id="7" w:name="_Toc241675076"/>
       <w:r>
         <w:rPr>
           <w:rFonts w:ascii="Times New Roman" w:hAnsi="Times New Roman" w:cs="Times New Roman"/>
@@ -1107,6 +3800,7 @@
         </w:rPr>
         <w:t>.</w:t>
       </w:r>
+      <w:bookmarkEnd w:id="7"/>
     </w:p>
     <w:p>
       <w:pPr>
@@ -1126,9 +3820,11 @@
       <w:pPr>
         <w:pStyle w:val="Heading2"/>
       </w:pPr>
+      <w:bookmarkStart w:id="8" w:name="_Toc241675058"/>
       <w:r>
         <w:t>4.3 Compile the Program</w:t>
       </w:r>
+      <w:bookmarkEnd w:id="8"/>
     </w:p>
     <w:p>
       <w:pPr>
@@ -1218,30 +3914,8 @@
         <w:rPr>
           <w:rFonts w:ascii="Times New Roman" w:hAnsi="Times New Roman" w:cs="Times New Roman"/>
         </w:rPr>
-        <w:t xml:space="preserve"> </w:t>
-      </w:r>
-      <w:proofErr w:type="spellStart"/>
-      <w:r>
-        <w:rPr>
-          <w:rFonts w:ascii="Times New Roman" w:hAnsi="Times New Roman" w:cs="Times New Roman"/>
-        </w:rPr>
-        <w:t>datatype_size.c</w:t>
-      </w:r>
-      <w:proofErr w:type="spellEnd"/>
-      <w:r>
-        <w:rPr>
-          <w:rFonts w:ascii="Times New Roman" w:hAnsi="Times New Roman" w:cs="Times New Roman"/>
-        </w:rPr>
-        <w:t xml:space="preserve"> -o </w:t>
-      </w:r>
-      <w:proofErr w:type="spellStart"/>
-      <w:r>
-        <w:rPr>
-          <w:rFonts w:ascii="Times New Roman" w:hAnsi="Times New Roman" w:cs="Times New Roman"/>
-        </w:rPr>
-        <w:t>datatype_size</w:t>
-      </w:r>
-      <w:proofErr w:type="spellEnd"/>
+        <w:t xml:space="preserve"> datatype_size.c -o datatype_size</w:t>
+      </w:r>
     </w:p>
     <w:p>
       <w:pPr>
@@ -1310,6 +3984,7 @@
         </w:rPr>
         <w:t xml:space="preserve">                                    </w:t>
       </w:r>
+      <w:bookmarkStart w:id="9" w:name="_Toc241675077"/>
       <w:r>
         <w:rPr>
           <w:rFonts w:ascii="Times New Roman" w:hAnsi="Times New Roman" w:cs="Times New Roman"/>
@@ -1367,6 +4042,7 @@
         </w:rPr>
         <w:t>: Compiling the data type size program.</w:t>
       </w:r>
+      <w:bookmarkEnd w:id="9"/>
     </w:p>
     <w:p>
       <w:pPr>
@@ -1379,9 +4055,11 @@
       <w:pPr>
         <w:pStyle w:val="Heading2"/>
       </w:pPr>
+      <w:bookmarkStart w:id="10" w:name="_Toc241675059"/>
       <w:r>
         <w:t>4.4 Run the Program</w:t>
       </w:r>
+      <w:bookmarkEnd w:id="10"/>
     </w:p>
     <w:p>
       <w:pPr>
@@ -1531,6 +4209,7 @@
         </w:rPr>
         <w:t xml:space="preserve">                         </w:t>
       </w:r>
+      <w:bookmarkStart w:id="11" w:name="_Toc241675078"/>
       <w:r>
         <w:rPr>
           <w:rFonts w:ascii="Times New Roman" w:hAnsi="Times New Roman" w:cs="Times New Roman"/>
@@ -1588,6 +4267,7 @@
         </w:rPr>
         <w:t>: Executing the data type size program and displaying the output.</w:t>
       </w:r>
+      <w:bookmarkEnd w:id="11"/>
     </w:p>
     <w:p>
       <w:pPr>
@@ -1601,9 +4281,11 @@
         <w:pStyle w:val="Heading2"/>
         <w:jc w:val="both"/>
       </w:pPr>
+      <w:bookmarkStart w:id="12" w:name="_Toc241675060"/>
       <w:r>
         <w:t>4.5 View the Generated Files</w:t>
       </w:r>
+      <w:bookmarkEnd w:id="12"/>
     </w:p>
     <w:p>
       <w:pPr>
@@ -1715,6 +4397,7 @@
         </w:rPr>
         <w:t xml:space="preserve">                                </w:t>
       </w:r>
+      <w:bookmarkStart w:id="13" w:name="_Toc241675079"/>
       <w:r>
         <w:rPr>
           <w:rFonts w:ascii="Times New Roman" w:hAnsi="Times New Roman" w:cs="Times New Roman"/>
@@ -1772,6 +4455,7 @@
         </w:rPr>
         <w:t>: Listing the source file and compiled executable.</w:t>
       </w:r>
+      <w:bookmarkEnd w:id="13"/>
     </w:p>
     <w:p>
       <w:pPr>
@@ -1792,19 +4476,23 @@
         <w:pStyle w:val="Heading1"/>
         <w:jc w:val="both"/>
       </w:pPr>
+      <w:bookmarkStart w:id="14" w:name="_Toc241675061"/>
       <w:r>
         <w:lastRenderedPageBreak/>
         <w:t>5. Experiment 2: Pointer and Dynamic Memory</w:t>
       </w:r>
+      <w:bookmarkEnd w:id="14"/>
     </w:p>
     <w:p>
       <w:pPr>
         <w:pStyle w:val="Heading2"/>
         <w:jc w:val="both"/>
       </w:pPr>
+      <w:bookmarkStart w:id="15" w:name="_Toc241675062"/>
       <w:r>
         <w:t>5.1 Create the Pointer Program</w:t>
       </w:r>
+      <w:bookmarkEnd w:id="15"/>
     </w:p>
     <w:p>
       <w:pPr>
@@ -1948,6 +4636,7 @@
         </w:rPr>
         <w:t xml:space="preserve">                            </w:t>
       </w:r>
+      <w:bookmarkStart w:id="16" w:name="_Toc241675080"/>
       <w:r>
         <w:rPr>
           <w:rFonts w:ascii="Times New Roman" w:hAnsi="Times New Roman" w:cs="Times New Roman"/>
@@ -2023,6 +4712,7 @@
         </w:rPr>
         <w:t xml:space="preserve"> source file.</w:t>
       </w:r>
+      <w:bookmarkEnd w:id="16"/>
     </w:p>
     <w:p>
       <w:pPr>
@@ -2037,9 +4727,11 @@
         <w:pStyle w:val="Heading2"/>
         <w:jc w:val="both"/>
       </w:pPr>
+      <w:bookmarkStart w:id="17" w:name="_Toc241675063"/>
       <w:r>
         <w:t>5.2 Verify the Pointer Program</w:t>
       </w:r>
+      <w:bookmarkEnd w:id="17"/>
     </w:p>
     <w:p>
       <w:pPr>
@@ -2169,6 +4861,7 @@
         </w:rPr>
         <w:t xml:space="preserve">    </w:t>
       </w:r>
+      <w:bookmarkStart w:id="18" w:name="_Toc241675081"/>
       <w:r>
         <w:rPr>
           <w:rFonts w:ascii="Times New Roman" w:hAnsi="Times New Roman" w:cs="Times New Roman"/>
@@ -2226,6 +4919,7 @@
         </w:rPr>
         <w:t>: Listing the files in the Lab4 directory.</w:t>
       </w:r>
+      <w:bookmarkEnd w:id="18"/>
     </w:p>
     <w:p>
       <w:pPr>
@@ -2240,9 +4934,11 @@
         <w:pStyle w:val="Heading2"/>
         <w:jc w:val="both"/>
       </w:pPr>
+      <w:bookmarkStart w:id="19" w:name="_Toc241675064"/>
       <w:r>
         <w:t>5.3 View the Source Code</w:t>
       </w:r>
+      <w:bookmarkEnd w:id="19"/>
     </w:p>
     <w:p>
       <w:pPr>
@@ -2403,6 +5099,7 @@
         </w:rPr>
         <w:t xml:space="preserve">      </w:t>
       </w:r>
+      <w:bookmarkStart w:id="20" w:name="_Toc241675082"/>
       <w:r>
         <w:rPr>
           <w:rFonts w:ascii="Times New Roman" w:hAnsi="Times New Roman" w:cs="Times New Roman"/>
@@ -2488,6 +5185,7 @@
         </w:rPr>
         <w:t>.</w:t>
       </w:r>
+      <w:bookmarkEnd w:id="20"/>
     </w:p>
     <w:p>
       <w:pPr>
@@ -2509,10 +5207,12 @@
       <w:pPr>
         <w:pStyle w:val="Heading2"/>
       </w:pPr>
+      <w:bookmarkStart w:id="21" w:name="_Toc241675065"/>
       <w:r>
         <w:lastRenderedPageBreak/>
         <w:t>5.4 Compile the Pointer Program</w:t>
       </w:r>
+      <w:bookmarkEnd w:id="21"/>
     </w:p>
     <w:p>
       <w:pPr>
@@ -2678,6 +5378,7 @@
         </w:rPr>
         <w:t xml:space="preserve">                                </w:t>
       </w:r>
+      <w:bookmarkStart w:id="22" w:name="_Toc241675083"/>
       <w:r>
         <w:rPr>
           <w:rFonts w:ascii="Times New Roman" w:hAnsi="Times New Roman" w:cs="Times New Roman"/>
@@ -2735,6 +5436,7 @@
         </w:rPr>
         <w:t>: Compiling the pointer and dynamic memory program.</w:t>
       </w:r>
+      <w:bookmarkEnd w:id="22"/>
     </w:p>
     <w:p>
       <w:pPr>
@@ -2749,9 +5451,11 @@
         <w:pStyle w:val="Heading2"/>
         <w:jc w:val="both"/>
       </w:pPr>
+      <w:bookmarkStart w:id="23" w:name="_Toc241675066"/>
       <w:r>
         <w:t>5.5 Run the Pointer Program</w:t>
       </w:r>
+      <w:bookmarkEnd w:id="23"/>
     </w:p>
     <w:p>
       <w:pPr>
@@ -2883,6 +5587,7 @@
         </w:rPr>
         <w:t xml:space="preserve">                        </w:t>
       </w:r>
+      <w:bookmarkStart w:id="24" w:name="_Toc241675084"/>
       <w:r>
         <w:rPr>
           <w:rFonts w:ascii="Times New Roman" w:hAnsi="Times New Roman" w:cs="Times New Roman"/>
@@ -2940,6 +5645,7 @@
         </w:rPr>
         <w:t>: Executing the pointer and dynamic memory program.</w:t>
       </w:r>
+      <w:bookmarkEnd w:id="24"/>
     </w:p>
     <w:p>
       <w:pPr>
@@ -2954,18 +5660,22 @@
         <w:pStyle w:val="Heading1"/>
         <w:jc w:val="both"/>
       </w:pPr>
+      <w:bookmarkStart w:id="25" w:name="_Toc241675067"/>
       <w:r>
         <w:t>6. Experiment 3: Process Memory Segments</w:t>
       </w:r>
+      <w:bookmarkEnd w:id="25"/>
     </w:p>
     <w:p>
       <w:pPr>
         <w:pStyle w:val="Heading2"/>
         <w:jc w:val="both"/>
       </w:pPr>
+      <w:bookmarkStart w:id="26" w:name="_Toc241675068"/>
       <w:r>
         <w:t>6.1 Create the Memory Segment Program</w:t>
       </w:r>
+      <w:bookmarkEnd w:id="26"/>
     </w:p>
     <w:p>
       <w:pPr>
@@ -3110,6 +5820,7 @@
         </w:rPr>
         <w:t xml:space="preserve">                              </w:t>
       </w:r>
+      <w:bookmarkStart w:id="27" w:name="_Toc241675085"/>
       <w:r>
         <w:rPr>
           <w:rFonts w:ascii="Times New Roman" w:hAnsi="Times New Roman" w:cs="Times New Roman"/>
@@ -3185,6 +5896,7 @@
         </w:rPr>
         <w:t xml:space="preserve"> source file.</w:t>
       </w:r>
+      <w:bookmarkEnd w:id="27"/>
     </w:p>
     <w:p>
       <w:pPr>
@@ -3199,9 +5911,11 @@
         <w:pStyle w:val="Heading2"/>
         <w:jc w:val="both"/>
       </w:pPr>
+      <w:bookmarkStart w:id="28" w:name="_Toc241675069"/>
       <w:r>
         <w:t>6.2 View the Source Code</w:t>
       </w:r>
+      <w:bookmarkEnd w:id="28"/>
     </w:p>
     <w:p>
       <w:pPr>
@@ -3354,6 +6068,7 @@
         </w:rPr>
         <w:t xml:space="preserve">                            </w:t>
       </w:r>
+      <w:bookmarkStart w:id="29" w:name="_Toc241675086"/>
       <w:r>
         <w:rPr>
           <w:rFonts w:ascii="Times New Roman" w:hAnsi="Times New Roman" w:cs="Times New Roman"/>
@@ -3439,6 +6154,7 @@
         </w:rPr>
         <w:t>.</w:t>
       </w:r>
+      <w:bookmarkEnd w:id="29"/>
     </w:p>
     <w:p>
       <w:pPr>
@@ -3449,6 +6165,7 @@
           <w:bCs/>
         </w:rPr>
       </w:pPr>
+      <w:bookmarkStart w:id="30" w:name="_Toc241675070"/>
       <w:r>
         <w:t>6.3</w:t>
       </w:r>
@@ -3462,6 +6179,7 @@
       <w:r>
         <w:t>Compile the Program</w:t>
       </w:r>
+      <w:bookmarkEnd w:id="30"/>
     </w:p>
     <w:p>
       <w:pPr>
@@ -3648,6 +6366,7 @@
         </w:rPr>
         <w:t xml:space="preserve">                            </w:t>
       </w:r>
+      <w:bookmarkStart w:id="31" w:name="_Toc241675087"/>
       <w:r>
         <w:rPr>
           <w:rFonts w:ascii="Times New Roman" w:hAnsi="Times New Roman" w:cs="Times New Roman"/>
@@ -3705,6 +6424,7 @@
         </w:rPr>
         <w:t>:Compiling the memory segment program.</w:t>
       </w:r>
+      <w:bookmarkEnd w:id="31"/>
     </w:p>
     <w:p>
       <w:pPr>
@@ -3719,9 +6439,11 @@
         <w:pStyle w:val="Heading2"/>
         <w:jc w:val="both"/>
       </w:pPr>
+      <w:bookmarkStart w:id="32" w:name="_Toc241675071"/>
       <w:r>
         <w:t>6.4 Run the Memory Segment Program</w:t>
       </w:r>
+      <w:bookmarkEnd w:id="32"/>
     </w:p>
     <w:p>
       <w:pPr>
@@ -3845,6 +6567,7 @@
         </w:rPr>
         <w:t xml:space="preserve">            </w:t>
       </w:r>
+      <w:bookmarkStart w:id="33" w:name="_Toc241675088"/>
       <w:r>
         <w:rPr>
           <w:rFonts w:ascii="Times New Roman" w:hAnsi="Times New Roman" w:cs="Times New Roman"/>
@@ -3902,6 +6625,7 @@
         </w:rPr>
         <w:t>: Displaying process memory segment addresses and variable values.</w:t>
       </w:r>
+      <w:bookmarkEnd w:id="33"/>
     </w:p>
     <w:p>
       <w:pPr>
@@ -3943,6 +6667,7 @@
           <w:szCs w:val="32"/>
         </w:rPr>
       </w:pPr>
+      <w:bookmarkStart w:id="34" w:name="_Toc241675072"/>
       <w:r>
         <w:rPr>
           <w:sz w:val="32"/>
@@ -3951,6 +6676,7 @@
         <w:lastRenderedPageBreak/>
         <w:t>7. Explanation of the Memory Areas</w:t>
       </w:r>
+      <w:bookmarkEnd w:id="34"/>
     </w:p>
     <w:p>
       <w:pPr>
@@ -4077,9 +6803,11 @@
         <w:pStyle w:val="Heading1"/>
         <w:jc w:val="both"/>
       </w:pPr>
+      <w:bookmarkStart w:id="35" w:name="_Toc241675073"/>
       <w:r>
         <w:t>8. Conclusion</w:t>
       </w:r>
+      <w:bookmarkEnd w:id="35"/>
     </w:p>
     <w:p>
       <w:pPr>
@@ -4108,8 +6836,13 @@
         <w:pStyle w:val="Heading1"/>
       </w:pPr>
       <w:r>
-        <w:t xml:space="preserve"> GitHub Repository</w:t>
-      </w:r>
+        <w:t xml:space="preserve"> </w:t>
+      </w:r>
+      <w:bookmarkStart w:id="36" w:name="_Toc241675074"/>
+      <w:r>
+        <w:t>GitHub Repository</w:t>
+      </w:r>
+      <w:bookmarkEnd w:id="36"/>
       <w:r>
         <w:rPr>
           <w:vanish/>
@@ -5710,6 +8443,61 @@
       <w:shd w:val="clear" w:color="auto" w:fill="E1DFDD"/>
     </w:rPr>
   </w:style>
+  <w:style w:type="paragraph" w:styleId="TOCHeading">
+    <w:name w:val="TOC Heading"/>
+    <w:basedOn w:val="Heading1"/>
+    <w:next w:val="Normal"/>
+    <w:uiPriority w:val="39"/>
+    <w:unhideWhenUsed/>
+    <w:qFormat/>
+    <w:rsid w:val="0078735D"/>
+    <w:pPr>
+      <w:spacing w:before="240" w:after="0" w:line="259" w:lineRule="auto"/>
+      <w:outlineLvl w:val="9"/>
+    </w:pPr>
+    <w:rPr>
+      <w:kern w:val="0"/>
+      <w:sz w:val="32"/>
+      <w:szCs w:val="32"/>
+      <w14:ligatures w14:val="none"/>
+    </w:rPr>
+  </w:style>
+  <w:style w:type="paragraph" w:styleId="TOC1">
+    <w:name w:val="toc 1"/>
+    <w:basedOn w:val="Normal"/>
+    <w:next w:val="Normal"/>
+    <w:autoRedefine/>
+    <w:uiPriority w:val="39"/>
+    <w:unhideWhenUsed/>
+    <w:rsid w:val="0078735D"/>
+    <w:pPr>
+      <w:spacing w:after="100"/>
+    </w:pPr>
+  </w:style>
+  <w:style w:type="paragraph" w:styleId="TOC2">
+    <w:name w:val="toc 2"/>
+    <w:basedOn w:val="Normal"/>
+    <w:next w:val="Normal"/>
+    <w:autoRedefine/>
+    <w:uiPriority w:val="39"/>
+    <w:unhideWhenUsed/>
+    <w:rsid w:val="0078735D"/>
+    <w:pPr>
+      <w:spacing w:after="100"/>
+      <w:ind w:left="240"/>
+    </w:pPr>
+  </w:style>
+  <w:style w:type="paragraph" w:styleId="TableofFigures">
+    <w:name w:val="table of figures"/>
+    <w:basedOn w:val="Normal"/>
+    <w:next w:val="Normal"/>
+    <w:uiPriority w:val="99"/>
+    <w:unhideWhenUsed/>
+    <w:rsid w:val="0078735D"/>
+    <w:pPr>
+      <w:spacing w:after="0"/>
+    </w:pPr>
+  </w:style>
 </w:styles>
 </file>
 
@@ -6029,6 +8817,10 @@
 </file>
 
 <file path=customXml/item1.xml><?xml version="1.0" encoding="utf-8"?>
+<b:Sources xmlns:b="http://schemas.openxmlformats.org/officeDocument/2006/bibliography" xmlns="http://schemas.openxmlformats.org/officeDocument/2006/bibliography" SelectedStyle="\APASixthEditionOfficeOnline.xsl" StyleName="APA" Version="6"/>
+</file>
+
+<file path=customXml/item2.xml><?xml version="1.0" encoding="utf-8"?>
 <ct:contentTypeSchema xmlns:ct="http://schemas.microsoft.com/office/2006/metadata/contentType" xmlns:ma="http://schemas.microsoft.com/office/2006/metadata/properties/metaAttributes" ct:_="" ma:_="" ma:contentTypeName="Document" ma:contentTypeID="0x010100718A2BDD6E36DD42B603146013276FDF" ma:contentTypeVersion="5" ma:contentTypeDescription="Create a new document." ma:contentTypeScope="" ma:versionID="edf718c9581d93380b73f8976fd4e3a7">
   <xsd:schema xmlns:xsd="http://www.w3.org/2001/XMLSchema" xmlns:xs="http://www.w3.org/2001/XMLSchema" xmlns:p="http://schemas.microsoft.com/office/2006/metadata/properties" xmlns:ns3="59031be6-925c-4b90-99b1-025b9e1b4c26" targetNamespace="http://schemas.microsoft.com/office/2006/metadata/properties" ma:root="true" ma:fieldsID="2d43ae146effa78f8ab827988c75b9ba" ns3:_="">
     <xsd:import namespace="59031be6-925c-4b90-99b1-025b9e1b4c26"/>
@@ -6178,19 +8970,7 @@
 </ct:contentTypeSchema>
 </file>
 
-<file path=customXml/item2.xml><?xml version="1.0" encoding="utf-8"?>
-<b:Sources xmlns:b="http://schemas.openxmlformats.org/officeDocument/2006/bibliography" xmlns="http://schemas.openxmlformats.org/officeDocument/2006/bibliography" SelectedStyle="\APASixthEditionOfficeOnline.xsl" StyleName="APA" Version="6"/>
-</file>
-
 <file path=customXml/item3.xml><?xml version="1.0" encoding="utf-8"?>
-<p:properties xmlns:p="http://schemas.microsoft.com/office/2006/metadata/properties" xmlns:xsi="http://www.w3.org/2001/XMLSchema-instance" xmlns:pc="http://schemas.microsoft.com/office/infopath/2007/PartnerControls">
-  <documentManagement>
-    <_activity xmlns="59031be6-925c-4b90-99b1-025b9e1b4c26" xsi:nil="true"/>
-  </documentManagement>
-</p:properties>
-</file>
-
-<file path=customXml/item4.xml><?xml version="1.0" encoding="utf-8"?>
 <?mso-contentType ?>
 <FormTemplates xmlns="http://schemas.microsoft.com/sharepoint/v3/contenttype/forms">
   <Display>DocumentLibraryForm</Display>
@@ -6199,7 +8979,23 @@
 </FormTemplates>
 </file>
 
+<file path=customXml/item4.xml><?xml version="1.0" encoding="utf-8"?>
+<p:properties xmlns:p="http://schemas.microsoft.com/office/2006/metadata/properties" xmlns:xsi="http://www.w3.org/2001/XMLSchema-instance" xmlns:pc="http://schemas.microsoft.com/office/infopath/2007/PartnerControls">
+  <documentManagement>
+    <_activity xmlns="59031be6-925c-4b90-99b1-025b9e1b4c26" xsi:nil="true"/>
+  </documentManagement>
+</p:properties>
+</file>
+
 <file path=customXml/itemProps1.xml><?xml version="1.0" encoding="utf-8"?>
+<ds:datastoreItem xmlns:ds="http://schemas.openxmlformats.org/officeDocument/2006/customXml" ds:itemID="{BC8F6821-097D-474B-9532-2A11BDB925C7}">
+  <ds:schemaRefs>
+    <ds:schemaRef ds:uri="http://schemas.openxmlformats.org/officeDocument/2006/bibliography"/>
+  </ds:schemaRefs>
+</ds:datastoreItem>
+</file>
+
+<file path=customXml/itemProps2.xml><?xml version="1.0" encoding="utf-8"?>
 <ds:datastoreItem xmlns:ds="http://schemas.openxmlformats.org/officeDocument/2006/customXml" ds:itemID="{F5BFD81A-2435-4AC3-B548-77EDF629B3A7}">
   <ds:schemaRefs>
     <ds:schemaRef ds:uri="http://schemas.microsoft.com/office/2006/metadata/contentType"/>
@@ -6217,15 +9013,15 @@
 </ds:datastoreItem>
 </file>
 
-<file path=customXml/itemProps2.xml><?xml version="1.0" encoding="utf-8"?>
-<ds:datastoreItem xmlns:ds="http://schemas.openxmlformats.org/officeDocument/2006/customXml" ds:itemID="{BC8F6821-097D-474B-9532-2A11BDB925C7}">
+<file path=customXml/itemProps3.xml><?xml version="1.0" encoding="utf-8"?>
+<ds:datastoreItem xmlns:ds="http://schemas.openxmlformats.org/officeDocument/2006/customXml" ds:itemID="{CD6B9736-5F4B-4D29-A722-11B698AFD445}">
   <ds:schemaRefs>
-    <ds:schemaRef ds:uri="http://schemas.openxmlformats.org/officeDocument/2006/bibliography"/>
+    <ds:schemaRef ds:uri="http://schemas.microsoft.com/sharepoint/v3/contenttype/forms"/>
   </ds:schemaRefs>
 </ds:datastoreItem>
 </file>
 
-<file path=customXml/itemProps3.xml><?xml version="1.0" encoding="utf-8"?>
+<file path=customXml/itemProps4.xml><?xml version="1.0" encoding="utf-8"?>
 <ds:datastoreItem xmlns:ds="http://schemas.openxmlformats.org/officeDocument/2006/customXml" ds:itemID="{CA78754B-31DD-434F-942E-B611E75F639B}">
   <ds:schemaRefs>
     <ds:schemaRef ds:uri="http://schemas.microsoft.com/office/2006/metadata/properties"/>
@@ -6233,12 +9029,4 @@
     <ds:schemaRef ds:uri="59031be6-925c-4b90-99b1-025b9e1b4c26"/>
   </ds:schemaRefs>
 </ds:datastoreItem>
-</file>
-
-<file path=customXml/itemProps4.xml><?xml version="1.0" encoding="utf-8"?>
-<ds:datastoreItem xmlns:ds="http://schemas.openxmlformats.org/officeDocument/2006/customXml" ds:itemID="{CD6B9736-5F4B-4D29-A722-11B698AFD445}">
-  <ds:schemaRefs>
-    <ds:schemaRef ds:uri="http://schemas.microsoft.com/sharepoint/v3/contenttype/forms"/>
-  </ds:schemaRefs>
-</ds:datastoreItem>
 </file>
</xml_diff>